<commit_message>
Pinout: apply independent verification (A22 wired to charging, Denso 4-wire A/F, D29 source)
A second read-only agent rebuilt all 135 terminals from the FSM: 134/135 agreed. A22 is not spare (WI-111, to CHG-01); front A/F is a Denso 4-wire sensor with A2+A3 joined to the heater (WI-113); D29 goes to DLC pin 6 (WI-112). README records the model-year evidence and the rusEFI 2005 pinout's D14/D15 and B26/B27 swaps to meter on the car.

Co-Authored-By: Claude Opus 5.5 <noreply@anthropic.com>
</commit_message>
<xml_diff>
--- a/documents/STI2004-pinout-findings.docx
+++ b/documents/STI2004-pinout-findings.docx
@@ -404,7 +404,7 @@
     </w:p>
     <w:p>
       <w:r>
-        <w:t xml:space="preserve">Status counts on rev-b: 47 OK, 3 mismatch, 16 label only, 34 not wired, 2 to check, 33 unused by the car.</w:t>
+        <w:t xml:space="preserve">Status counts on rev-b: 47 OK, 3 mismatch, 16 label only, 34 not wired, 3 to check, 32 unused by the car.</w:t>
       </w:r>
     </w:p>
     <w:p>
@@ -627,10 +627,10 @@
         <w:rPr>
           <w:b/>
         </w:rPr>
-        <w:t xml:space="preserve">Denso 5-wire A/F</w:t>
-      </w:r>
-      <w:r>
-        <w:t xml:space="preserve">, not a Bosch LSU, so the Hellen WBO module cannot read it as is: either fit an LSU 4.9 or add a Denso A/F interface. Decision needed.</w:t>
+        <w:t xml:space="preserve">Denso 4-wire A/F</w:t>
+      </w:r>
+      <w:r>
+        <w:t xml:space="preserve"> (plug B18: heater +12 V from the main relay, heater return to A2 and A3 joined in the harness, signal A33/A26), not a Bosch LSU, so the Hellen WBO module cannot read it as is: either fit an LSU 4.9 or add a Denso A/F interface. Decision needed.</w:t>
       </w:r>
     </w:p>
     <w:p>
@@ -704,7 +704,7 @@
         </w:numPr>
       </w:pPr>
       <w:r>
-        <w:t xml:space="preserve">D29 is not in the I/O table, but WI-107 draws a line from it toward the data link connector. Confirm on the car before using it.</w:t>
+        <w:t xml:space="preserve">D29 is not in the I/O table; WI-112 shows a red/white wire to data link connector pin 6. Leave it unconnected.</w:t>
       </w:r>
     </w:p>
     <w:p>
@@ -716,6 +716,18 @@
         </w:numPr>
       </w:pPr>
       <w:r>
+        <w:t xml:space="preserve">A22 is not in the I/O table, but WI-111 shows a blue wire to the charging system (CHG-01). It is not a spare pin: do not ground or drive it, and measure it on the car.</w:t>
+      </w:r>
+    </w:p>
+    <w:p>
+      <w:pPr>
+        <w:pStyle w:val="ListParagraph"/>
+        <w:numPr>
+          <w:ilvl w:val="0"/>
+          <w:numId w:val="3"/>
+        </w:numPr>
+      </w:pPr>
+      <w:r>
         <w:t xml:space="preserve">Sensor returns (C31, C34, C35, D3) are on the power GND. rusEFI boards usually return sensors to an analog ground; worth a look before layout.</w:t>
       </w:r>
     </w:p>
@@ -770,6 +782,117 @@
       </w:r>
       <w:r>
         <w:t xml:space="preserve"> notes "A/C relay control" on the B22 row (crank signal -); it belongs on B33. It also leaves A34 (ground) blank.</w:t>
+      </w:r>
+    </w:p>
+    <w:p>
+      <w:pPr>
+        <w:pStyle w:val="Heading2"/>
+      </w:pPr>
+      <w:r>
+        <w:t xml:space="preserve">Independent verification (2026-10-13)</w:t>
+      </w:r>
+    </w:p>
+    <w:p>
+      <w:r>
+        <w:t xml:space="preserve">A second agent (Claude Fable, read-only) rebuilt all 135 terminals from the FSM pages without seeing this table, then compared. 134 of 135 rows agreed; the one difference was A22 (wired to the charging system, now recorded), plus the A/F sensor wire count (4, not 5, now fixed).</w:t>
+      </w:r>
+    </w:p>
+    <w:p>
+      <w:pPr>
+        <w:pStyle w:val="ListParagraph"/>
+        <w:numPr>
+          <w:ilvl w:val="0"/>
+          <w:numId w:val="5"/>
+        </w:numPr>
+      </w:pPr>
+      <w:r>
+        <w:rPr>
+          <w:b/>
+        </w:rPr>
+        <w:t xml:space="preserve">Model year:</w:t>
+      </w:r>
+      <w:r>
+        <w:t xml:space="preserve"> consistent with the 2004 USDM STI: four ECM plugs (135 terminals), drive-by-wire with ETC relay, dual AVCS, TGVs, MAF plus MAP, fuel pump control unit, USDM EVAP, Denso 4-wire A/F, no immobilizer line. The I/O table PDF is dated 2003-05-12. rusEFI's documentation files the byte-identical table as "2005-2007 GDA/GDB"; the community and plug-in ECU makers treat 2004-2006 USDM STI pinouts as the same.</w:t>
+      </w:r>
+    </w:p>
+    <w:p>
+      <w:pPr>
+        <w:pStyle w:val="ListParagraph"/>
+        <w:numPr>
+          <w:ilvl w:val="0"/>
+          <w:numId w:val="5"/>
+        </w:numPr>
+      </w:pPr>
+      <w:r>
+        <w:rPr>
+          <w:b/>
+        </w:rPr>
+        <w:t xml:space="preserve">Plug letters</w:t>
+      </w:r>
+      <w:r>
+        <w:t xml:space="preserve"> A = B134, B = B135, C = B136, D = B137 are printed on WI-108, WI-111 and WI-113 and match the pin-grid drawings.</w:t>
+      </w:r>
+    </w:p>
+    <w:p>
+      <w:pPr>
+        <w:pStyle w:val="ListParagraph"/>
+        <w:numPr>
+          <w:ilvl w:val="0"/>
+          <w:numId w:val="5"/>
+        </w:numPr>
+      </w:pPr>
+      <w:r>
+        <w:rPr>
+          <w:b/>
+        </w:rPr>
+        <w:t xml:space="preserve">Community disagreement:</w:t>
+      </w:r>
+      <w:r>
+        <w:t xml:space="preserve"> rusEFI's </w:t>
+      </w:r>
+      <w:hyperlink r:id="rId1" w:history="1">
+        <w:r>
+          <w:t xml:space="preserve">2005 STI EJ257 pinout</w:t>
+        </w:r>
+      </w:hyperlink>
+      <w:r>
+        <w:t xml:space="preserve"> (from a Mitchell diagram) swaps D14/D15 and B26/B27, and flags them itself for on-car checking. The FSM table and wire colours on WI-108/109/112 support this table (D14 test mode, D15 ignition switch, B26 fuel pump control unit, B27 vehicle speed). Confirm these four with a meter before power-up.</w:t>
+      </w:r>
+    </w:p>
+    <w:p>
+      <w:pPr>
+        <w:pStyle w:val="ListParagraph"/>
+        <w:numPr>
+          <w:ilvl w:val="0"/>
+          <w:numId w:val="5"/>
+        </w:numPr>
+      </w:pPr>
+      <w:r>
+        <w:rPr>
+          <w:b/>
+        </w:rPr>
+        <w:t xml:space="preserve">Not usable:</w:t>
+      </w:r>
+      <w:r>
+        <w:t xml:space="preserve"> the allpinouts.org "2004 STI ECU" page is a 2002-03 WRX layout (five connectors, wrong pin counts).</w:t>
+      </w:r>
+    </w:p>
+    <w:p>
+      <w:pPr>
+        <w:pStyle w:val="ListParagraph"/>
+        <w:numPr>
+          <w:ilvl w:val="0"/>
+          <w:numId w:val="5"/>
+        </w:numPr>
+      </w:pPr>
+      <w:r>
+        <w:rPr>
+          <w:b/>
+        </w:rPr>
+        <w:t xml:space="preserve">Could not verify from documents:</w:t>
+      </w:r>
+      <w:r>
+        <w:t xml:space="preserve"> the function of A22 and D29, and the physical polarity of the throttle motor pins D4/D5.</w:t>
       </w:r>
     </w:p>
     <w:sectPr>
@@ -1201,6 +1324,117 @@
       </w:rPr>
     </w:lvl>
   </w:abstractNum>
+  <w:abstractNum w:abstractNumId="4">
+    <w:multiLevelType w:val="multilevel"/>
+    <w:lvl w:ilvl="0">
+      <w:start w:val="1"/>
+      <w:numFmt w:val="bullet"/>
+      <w:lvlText w:val="•"/>
+      <w:lvlJc w:val="left"/>
+      <w:pPr>
+        <w:ind w:left="720" w:hanging="360"/>
+      </w:pPr>
+      <w:rPr>
+        <w:rFonts w:ascii="Arial" w:hAnsi="Arial"/>
+      </w:rPr>
+    </w:lvl>
+    <w:lvl w:ilvl="1">
+      <w:start w:val="1"/>
+      <w:numFmt w:val="bullet"/>
+      <w:lvlText w:val="○"/>
+      <w:lvlJc w:val="left"/>
+      <w:pPr>
+        <w:ind w:left="1440" w:hanging="360"/>
+      </w:pPr>
+      <w:rPr>
+        <w:rFonts w:ascii="Arial" w:hAnsi="Arial"/>
+      </w:rPr>
+    </w:lvl>
+    <w:lvl w:ilvl="2">
+      <w:start w:val="1"/>
+      <w:numFmt w:val="bullet"/>
+      <w:lvlText w:val="▪"/>
+      <w:lvlJc w:val="left"/>
+      <w:pPr>
+        <w:ind w:left="2160" w:hanging="360"/>
+      </w:pPr>
+      <w:rPr>
+        <w:rFonts w:ascii="Arial" w:hAnsi="Arial"/>
+      </w:rPr>
+    </w:lvl>
+    <w:lvl w:ilvl="3">
+      <w:start w:val="1"/>
+      <w:numFmt w:val="bullet"/>
+      <w:lvlText w:val="•"/>
+      <w:lvlJc w:val="left"/>
+      <w:pPr>
+        <w:ind w:left="2880" w:hanging="360"/>
+      </w:pPr>
+      <w:rPr>
+        <w:rFonts w:ascii="Arial" w:hAnsi="Arial"/>
+      </w:rPr>
+    </w:lvl>
+    <w:lvl w:ilvl="4">
+      <w:start w:val="1"/>
+      <w:numFmt w:val="bullet"/>
+      <w:lvlText w:val="○"/>
+      <w:lvlJc w:val="left"/>
+      <w:pPr>
+        <w:ind w:left="3600" w:hanging="360"/>
+      </w:pPr>
+      <w:rPr>
+        <w:rFonts w:ascii="Arial" w:hAnsi="Arial"/>
+      </w:rPr>
+    </w:lvl>
+    <w:lvl w:ilvl="5">
+      <w:start w:val="1"/>
+      <w:numFmt w:val="bullet"/>
+      <w:lvlText w:val="▪"/>
+      <w:lvlJc w:val="left"/>
+      <w:pPr>
+        <w:ind w:left="4320" w:hanging="360"/>
+      </w:pPr>
+      <w:rPr>
+        <w:rFonts w:ascii="Arial" w:hAnsi="Arial"/>
+      </w:rPr>
+    </w:lvl>
+    <w:lvl w:ilvl="6">
+      <w:start w:val="1"/>
+      <w:numFmt w:val="bullet"/>
+      <w:lvlText w:val="•"/>
+      <w:lvlJc w:val="left"/>
+      <w:pPr>
+        <w:ind w:left="5040" w:hanging="360"/>
+      </w:pPr>
+      <w:rPr>
+        <w:rFonts w:ascii="Arial" w:hAnsi="Arial"/>
+      </w:rPr>
+    </w:lvl>
+    <w:lvl w:ilvl="7">
+      <w:start w:val="1"/>
+      <w:numFmt w:val="bullet"/>
+      <w:lvlText w:val="○"/>
+      <w:lvlJc w:val="left"/>
+      <w:pPr>
+        <w:ind w:left="5760" w:hanging="360"/>
+      </w:pPr>
+      <w:rPr>
+        <w:rFonts w:ascii="Arial" w:hAnsi="Arial"/>
+      </w:rPr>
+    </w:lvl>
+    <w:lvl w:ilvl="8">
+      <w:start w:val="1"/>
+      <w:numFmt w:val="bullet"/>
+      <w:lvlText w:val="▪"/>
+      <w:lvlJc w:val="left"/>
+      <w:pPr>
+        <w:ind w:left="6480" w:hanging="360"/>
+      </w:pPr>
+      <w:rPr>
+        <w:rFonts w:ascii="Arial" w:hAnsi="Arial"/>
+      </w:rPr>
+    </w:lvl>
+  </w:abstractNum>
   <w:num w:numId="1">
     <w:abstractNumId w:val="0"/>
   </w:num>
@@ -1212,6 +1446,9 @@
   </w:num>
   <w:num w:numId="4">
     <w:abstractNumId w:val="3"/>
+  </w:num>
+  <w:num w:numId="5">
+    <w:abstractNumId w:val="4"/>
   </w:num>
 </w:numbering>
 </file>

</xml_diff>

<commit_message>
Own 5 V for the pedal, CAN terminator option, Mini-Fit Jr aux connector
- Pedal supply C15 (APS_PS_5V) now from the second power module M8's protected 5 V; C16 sensor 5 V stays on M14. M8 fed like M14 (+12V_RAW, +12V_IGN, +12V_BACK_UP, PWR_EN). Open JP11 falls back to +5VAS; M8 power-good on pad P32.
- CAN: M1 terminates internally (R100 120R); WBO has none. R52 120R (DNP) at the aux connector for an external bus end.
- J3 aux connector, Molex Mini-Fit Jr 5566-14A 2x7 vertical (39281143): +12 V via F6 0.5 A PTC, +5 V sensor via F7 50 mA PTC, sensor ground, AUX_IN1-3 (launch/2-step, map switch, spare), AUX_AN1 (IN_RES2), AUX_AN2 (IN_AT2, shared with the FPCU status option), two low-side outputs, CAN H/L, 2x GND. Symbol and footprint from KiCad 8.0.7 libs; footprint copied into STI.pretty.

Verified: 104 planned nets match the netlist; whole-netlist diff clean; ERC errors 155 -> 148, no new types; pinout check 99 OK.

Co-Authored-By: Claude Opus 5.5 <noreply@anthropic.com>
</commit_message>
<xml_diff>
--- a/documents/STI2004-pinout-findings.docx
+++ b/documents/STI2004-pinout-findings.docx
@@ -1851,7 +1851,422 @@
         </w:numPr>
       </w:pPr>
       <w:r>
-        <w:t xml:space="preserve">Still unused: M7 (second knock module; the STI has one knock sensor) and M8 (second power module, earmarked to give the pedal C15 its own 5 V).</w:t>
+        <w:rPr>
+          <w:b/>
+        </w:rPr>
+        <w:t xml:space="preserve">Pedal 5 V is now its own rail.</w:t>
+      </w:r>
+      <w:r>
+        <w:t xml:space="preserve"> The pedal supply C15 (net APS_PS_5V) comes from the second power module M8's protected 5 V; the throttle/MAP/TGV sensor supply C16 stays on M14 (+5VAS). A shared rail would let one short take out both pedal and throttle sensors and defeat their plausibility check. JP11 (open) puts the pedal back on +5VAS if M8 is not fitted; M8's power-good is on pad P32.</w:t>
+      </w:r>
+    </w:p>
+    <w:p>
+      <w:pPr>
+        <w:pStyle w:val="ListParagraph"/>
+        <w:numPr>
+          <w:ilvl w:val="0"/>
+          <w:numId w:val="1"/>
+        </w:numPr>
+      </w:pPr>
+      <w:r>
+        <w:rPr>
+          <w:b/>
+        </w:rPr>
+        <w:t xml:space="preserve">CAN termination:</w:t>
+      </w:r>
+      <w:r>
+        <w:t xml:space="preserve"> M1 already has 120R across CANH/CANL (R100 on mega-mcu144 sheet 15); the WBO module has none. R52 (120R, DNP) at the aux connector terminates the far end if an external device on the aux CAN does not.</w:t>
+      </w:r>
+    </w:p>
+    <w:p>
+      <w:pPr>
+        <w:pStyle w:val="ListParagraph"/>
+        <w:numPr>
+          <w:ilvl w:val="0"/>
+          <w:numId w:val="1"/>
+        </w:numPr>
+      </w:pPr>
+      <w:r>
+        <w:t xml:space="preserve">Still unused: M7 (second knock module; the STI has one knock sensor).</w:t>
+      </w:r>
+    </w:p>
+    <w:p>
+      <w:pPr>
+        <w:pStyle w:val="Heading3"/>
+      </w:pPr>
+      <w:r>
+        <w:t xml:space="preserve">Aux connector J3: Molex Mini-Fit Jr 2x7 (5566-14A vertical, Molex 39281143)</w:t>
+      </w:r>
+    </w:p>
+    <w:p>
+      <w:r>
+        <w:t xml:space="preserve">Mating plug: Molex 39-01-2140 (5557-14R housing) with 39-00-0038 crimp terminals (5556, 18-24 AWG). Footprint </w:t>
+      </w:r>
+      <w:r>
+        <w:rPr>
+          <w:rFonts w:ascii="Courier New" w:hAnsi="Courier New"/>
+        </w:rPr>
+        <w:t xml:space="preserve">STI:Molex_Mini-Fit_Jr_5566-14A_2x07_P4.20mm_Vertical</w:t>
+      </w:r>
+      <w:r>
+        <w:t xml:space="preserve"> (copied from the KiCad 8.0.7 library). Through-hole, no LCSC number: hand-solder or order THT assembly; a right-angle 5569-14A footprint can be swapped in if the case needs it.</w:t>
+      </w:r>
+    </w:p>
+    <w:tbl>
+      <w:tblPr>
+        <w:tblStyle w:val="TableGrid"/>
+        <w:tblW w:w="0" w:type="auto"/>
+        <w:tblLook w:val="04A0" w:firstRow="1" w:lastRow="0" w:firstColumn="1" w:lastColumn="0" w:noHBand="0" w:noVBand="1"/>
+      </w:tblPr>
+      <w:tblGrid>
+        <w:gridCol w:w="2340"/>
+        <w:gridCol w:w="2340"/>
+        <w:gridCol w:w="2340"/>
+        <w:gridCol w:w="2340"/>
+      </w:tblGrid>
+      <w:tr>
+        <w:trPr>
+          <w:tblHeader/>
+        </w:trPr>
+        <w:tc>
+          <w:tcPr>
+            <w:tcW w:w="2340" w:type="dxa"/>
+          </w:tcPr>
+          <w:p>
+            <w:r>
+              <w:t xml:space="preserve">Pin</w:t>
+            </w:r>
+          </w:p>
+        </w:tc>
+        <w:tc>
+          <w:tcPr>
+            <w:tcW w:w="2340" w:type="dxa"/>
+          </w:tcPr>
+          <w:p>
+            <w:r>
+              <w:t xml:space="preserve">Signal</w:t>
+            </w:r>
+          </w:p>
+        </w:tc>
+        <w:tc>
+          <w:tcPr>
+            <w:tcW w:w="2340" w:type="dxa"/>
+          </w:tcPr>
+          <w:p>
+            <w:r>
+              <w:t xml:space="preserve">Pin</w:t>
+            </w:r>
+          </w:p>
+        </w:tc>
+        <w:tc>
+          <w:tcPr>
+            <w:tcW w:w="2340" w:type="dxa"/>
+          </w:tcPr>
+          <w:p>
+            <w:r>
+              <w:t xml:space="preserve">Signal</w:t>
+            </w:r>
+          </w:p>
+        </w:tc>
+      </w:tr>
+      <w:tr>
+        <w:tc>
+          <w:tcPr>
+            <w:tcW w:w="2340" w:type="dxa"/>
+          </w:tcPr>
+          <w:p>
+            <w:r>
+              <w:t xml:space="preserve">1</w:t>
+            </w:r>
+          </w:p>
+        </w:tc>
+        <w:tc>
+          <w:tcPr>
+            <w:tcW w:w="2340" w:type="dxa"/>
+          </w:tcPr>
+          <w:p>
+            <w:r>
+              <w:t xml:space="preserve">+12 V out (main relay, F6 0.5 A PTC)</w:t>
+            </w:r>
+          </w:p>
+        </w:tc>
+        <w:tc>
+          <w:tcPr>
+            <w:tcW w:w="2340" w:type="dxa"/>
+          </w:tcPr>
+          <w:p>
+            <w:r>
+              <w:t xml:space="preserve">2</w:t>
+            </w:r>
+          </w:p>
+        </w:tc>
+        <w:tc>
+          <w:tcPr>
+            <w:tcW w:w="2340" w:type="dxa"/>
+          </w:tcPr>
+          <w:p>
+            <w:r>
+              <w:t xml:space="preserve">GND</w:t>
+            </w:r>
+          </w:p>
+        </w:tc>
+      </w:tr>
+      <w:tr>
+        <w:tc>
+          <w:tcPr>
+            <w:tcW w:w="2340" w:type="dxa"/>
+          </w:tcPr>
+          <w:p>
+            <w:r>
+              <w:t xml:space="preserve">3</w:t>
+            </w:r>
+          </w:p>
+        </w:tc>
+        <w:tc>
+          <w:tcPr>
+            <w:tcW w:w="2340" w:type="dxa"/>
+          </w:tcPr>
+          <w:p>
+            <w:r>
+              <w:t xml:space="preserve">+5 V sensor out (+5VAS, F7 50 mA PTC)</w:t>
+            </w:r>
+          </w:p>
+        </w:tc>
+        <w:tc>
+          <w:tcPr>
+            <w:tcW w:w="2340" w:type="dxa"/>
+          </w:tcPr>
+          <w:p>
+            <w:r>
+              <w:t xml:space="preserve">4</w:t>
+            </w:r>
+          </w:p>
+        </w:tc>
+        <w:tc>
+          <w:tcPr>
+            <w:tcW w:w="2340" w:type="dxa"/>
+          </w:tcPr>
+          <w:p>
+            <w:r>
+              <w:t xml:space="preserve">Sensor ground (GND_SENSOR)</w:t>
+            </w:r>
+          </w:p>
+        </w:tc>
+      </w:tr>
+      <w:tr>
+        <w:tc>
+          <w:tcPr>
+            <w:tcW w:w="2340" w:type="dxa"/>
+          </w:tcPr>
+          <w:p>
+            <w:r>
+              <w:t xml:space="preserve">5</w:t>
+            </w:r>
+          </w:p>
+        </w:tc>
+        <w:tc>
+          <w:tcPr>
+            <w:tcW w:w="2340" w:type="dxa"/>
+          </w:tcPr>
+          <w:p>
+            <w:r>
+              <w:t xml:space="preserve">AUX_IN1 digital (launch / 2-step)</w:t>
+            </w:r>
+          </w:p>
+        </w:tc>
+        <w:tc>
+          <w:tcPr>
+            <w:tcW w:w="2340" w:type="dxa"/>
+          </w:tcPr>
+          <w:p>
+            <w:r>
+              <w:t xml:space="preserve">6</w:t>
+            </w:r>
+          </w:p>
+        </w:tc>
+        <w:tc>
+          <w:tcPr>
+            <w:tcW w:w="2340" w:type="dxa"/>
+          </w:tcPr>
+          <w:p>
+            <w:r>
+              <w:t xml:space="preserve">AUX_IN2 digital (map switch)</w:t>
+            </w:r>
+          </w:p>
+        </w:tc>
+      </w:tr>
+      <w:tr>
+        <w:tc>
+          <w:tcPr>
+            <w:tcW w:w="2340" w:type="dxa"/>
+          </w:tcPr>
+          <w:p>
+            <w:r>
+              <w:t xml:space="preserve">7</w:t>
+            </w:r>
+          </w:p>
+        </w:tc>
+        <w:tc>
+          <w:tcPr>
+            <w:tcW w:w="2340" w:type="dxa"/>
+          </w:tcPr>
+          <w:p>
+            <w:r>
+              <w:t xml:space="preserve">AUX_IN3 digital (spare, flex fuel frequency OK)</w:t>
+            </w:r>
+          </w:p>
+        </w:tc>
+        <w:tc>
+          <w:tcPr>
+            <w:tcW w:w="2340" w:type="dxa"/>
+          </w:tcPr>
+          <w:p>
+            <w:r>
+              <w:t xml:space="preserve">8</w:t>
+            </w:r>
+          </w:p>
+        </w:tc>
+        <w:tc>
+          <w:tcPr>
+            <w:tcW w:w="2340" w:type="dxa"/>
+          </w:tcPr>
+          <w:p>
+            <w:r>
+              <w:t xml:space="preserve">AUX_AN1 analog 0-5 V (IN_RES2, 340k)</w:t>
+            </w:r>
+          </w:p>
+        </w:tc>
+      </w:tr>
+      <w:tr>
+        <w:tc>
+          <w:tcPr>
+            <w:tcW w:w="2340" w:type="dxa"/>
+          </w:tcPr>
+          <w:p>
+            <w:r>
+              <w:t xml:space="preserve">9</w:t>
+            </w:r>
+          </w:p>
+        </w:tc>
+        <w:tc>
+          <w:tcPr>
+            <w:tcW w:w="2340" w:type="dxa"/>
+          </w:tcPr>
+          <w:p>
+            <w:r>
+              <w:t xml:space="preserve">AUX_AN2 analog (IN_AT2, 2.35k pull-up: thermistor-ready)</w:t>
+            </w:r>
+          </w:p>
+        </w:tc>
+        <w:tc>
+          <w:tcPr>
+            <w:tcW w:w="2340" w:type="dxa"/>
+          </w:tcPr>
+          <w:p>
+            <w:r>
+              <w:t xml:space="preserve">10</w:t>
+            </w:r>
+          </w:p>
+        </w:tc>
+        <w:tc>
+          <w:tcPr>
+            <w:tcW w:w="2340" w:type="dxa"/>
+          </w:tcPr>
+          <w:p>
+            <w:r>
+              <w:t xml:space="preserve">AUX_OUT1 low-side (LS4 ch3)</w:t>
+            </w:r>
+          </w:p>
+        </w:tc>
+      </w:tr>
+      <w:tr>
+        <w:tc>
+          <w:tcPr>
+            <w:tcW w:w="2340" w:type="dxa"/>
+          </w:tcPr>
+          <w:p>
+            <w:r>
+              <w:t xml:space="preserve">11</w:t>
+            </w:r>
+          </w:p>
+        </w:tc>
+        <w:tc>
+          <w:tcPr>
+            <w:tcW w:w="2340" w:type="dxa"/>
+          </w:tcPr>
+          <w:p>
+            <w:r>
+              <w:t xml:space="preserve">AUX_OUT2 low-side (LS4 ch4)</w:t>
+            </w:r>
+          </w:p>
+        </w:tc>
+        <w:tc>
+          <w:tcPr>
+            <w:tcW w:w="2340" w:type="dxa"/>
+          </w:tcPr>
+          <w:p>
+            <w:r>
+              <w:t xml:space="preserve">12</w:t>
+            </w:r>
+          </w:p>
+        </w:tc>
+        <w:tc>
+          <w:tcPr>
+            <w:tcW w:w="2340" w:type="dxa"/>
+          </w:tcPr>
+          <w:p>
+            <w:r>
+              <w:t xml:space="preserve">CAN H</w:t>
+            </w:r>
+          </w:p>
+        </w:tc>
+      </w:tr>
+      <w:tr>
+        <w:tc>
+          <w:tcPr>
+            <w:tcW w:w="2340" w:type="dxa"/>
+          </w:tcPr>
+          <w:p>
+            <w:r>
+              <w:t xml:space="preserve">13</w:t>
+            </w:r>
+          </w:p>
+        </w:tc>
+        <w:tc>
+          <w:tcPr>
+            <w:tcW w:w="2340" w:type="dxa"/>
+          </w:tcPr>
+          <w:p>
+            <w:r>
+              <w:t xml:space="preserve">CAN L</w:t>
+            </w:r>
+          </w:p>
+        </w:tc>
+        <w:tc>
+          <w:tcPr>
+            <w:tcW w:w="2340" w:type="dxa"/>
+          </w:tcPr>
+          <w:p>
+            <w:r>
+              <w:t xml:space="preserve">14</w:t>
+            </w:r>
+          </w:p>
+        </w:tc>
+        <w:tc>
+          <w:tcPr>
+            <w:tcW w:w="2340" w:type="dxa"/>
+          </w:tcPr>
+          <w:p>
+            <w:r>
+              <w:t xml:space="preserve">GND</w:t>
+            </w:r>
+          </w:p>
+        </w:tc>
+      </w:tr>
+    </w:tbl>
+    <w:p>
+      <w:r>
+        <w:t xml:space="preserve">AUX_IN1-3 expect a switch to 12 V (680k pull-down on the dinput4, R46-R48 4.7k options). AUX_AN2 shares IN_AT2 with the FPCU status option JP7: fit only one. AUX_OUT1/2 also reach EVAP A12/A13 through open JP5/JP6.</w:t>
       </w:r>
     </w:p>
     <w:p>
@@ -2051,7 +2466,7 @@
           </w:tcPr>
           <w:p>
             <w:r>
-              <w:t xml:space="preserve">to read pump status</w:t>
+              <w:t xml:space="preserve">to read pump status (then do not use AUX_AN2)</w:t>
             </w:r>
           </w:p>
         </w:tc>
@@ -2376,10 +2791,74 @@
           </w:p>
         </w:tc>
       </w:tr>
+      <w:tr>
+        <w:tc>
+          <w:tcPr>
+            <w:tcW w:w="3120" w:type="dxa"/>
+          </w:tcPr>
+          <w:p>
+            <w:r>
+              <w:t xml:space="preserve">JP11</w:t>
+            </w:r>
+          </w:p>
+        </w:tc>
+        <w:tc>
+          <w:tcPr>
+            <w:tcW w:w="3120" w:type="dxa"/>
+          </w:tcPr>
+          <w:p>
+            <w:r>
+              <w:t xml:space="preserve">Pedal 5 V back onto +5VAS</w:t>
+            </w:r>
+          </w:p>
+        </w:tc>
+        <w:tc>
+          <w:tcPr>
+            <w:tcW w:w="3120" w:type="dxa"/>
+          </w:tcPr>
+          <w:p>
+            <w:r>
+              <w:t xml:space="preserve">only if M8 is not fitted</w:t>
+            </w:r>
+          </w:p>
+        </w:tc>
+      </w:tr>
+      <w:tr>
+        <w:tc>
+          <w:tcPr>
+            <w:tcW w:w="3120" w:type="dxa"/>
+          </w:tcPr>
+          <w:p>
+            <w:r>
+              <w:t xml:space="preserve">R52 120R</w:t>
+            </w:r>
+          </w:p>
+        </w:tc>
+        <w:tc>
+          <w:tcPr>
+            <w:tcW w:w="3120" w:type="dxa"/>
+          </w:tcPr>
+          <w:p>
+            <w:r>
+              <w:t xml:space="preserve">CAN terminator at the aux connector</w:t>
+            </w:r>
+          </w:p>
+        </w:tc>
+        <w:tc>
+          <w:tcPr>
+            <w:tcW w:w="3120" w:type="dxa"/>
+          </w:tcPr>
+          <w:p>
+            <w:r>
+              <w:t xml:space="preserve">external CAN device that does not terminate</w:t>
+            </w:r>
+          </w:p>
+        </w:tc>
+      </w:tr>
     </w:tbl>
     <w:p>
       <w:r>
-        <w:t xml:space="preserve">Pads: P1-P7 LSU and CAN, P8 K-line, P9/P10 spare low-side outputs, P11 A22 charging wire, P12 FPCU status, P13 D29, P14-P18 spare MCU pins (IGN6-8, I2C SCL/SDA), P19-P22 rails, P23 BOOT0, P24-P26 SWD, P27/P28 OUT_PWM3 / IN_RES2, P29-P31 aux inputs (+5VA, +3.3V, +12V_RAW, GND), plus a prototype area G1 for any extra circuit.</w:t>
+        <w:t xml:space="preserve">Pads: P1-P7 LSU and CAN, P8 K-line, P9/P10 spare low-side outputs, P11 A22 charging wire, P12 FPCU status, P13 D29, P14-P18 spare MCU pins (IGN6-8, I2C SCL/SDA), P19-P22 rails, P23 BOOT0, P24-P26 SWD, P27/P28 OUT_PWM3 / IN_RES2, P29-P31 aux inputs, P32 M8 power-good (+5VA, +3.3V, +12V_RAW, GND), plus a prototype area G1 for any extra circuit.</w:t>
       </w:r>
     </w:p>
     <w:p>
@@ -2399,7 +2878,7 @@
         <w:t xml:space="preserve">Update PCB from Schematic</w:t>
       </w:r>
       <w:r>
-        <w:t xml:space="preserve">, then place and route the new parts (Q9-Q20, R11-R22 in the low-side sheets, R30-R51, JP1-JP10, P1-P31, M10-M12, J2, G1).</w:t>
+        <w:t xml:space="preserve">, then place and route the new parts (Q9-Q20, R11-R22 in the low-side sheets, R30-R52, JP1-JP11, F6-F7, P1-P32, M10-M12, J2, J3, G1; M8 now wired).</w:t>
       </w:r>
     </w:p>
     <w:p>

</xml_diff>

<commit_message>
Split the schematic into functional sheets with notes
Root page is now an overview (block per sheet, how to read it). Sheets: Vehicle connector (J1, all four plugs), Power (M14, M8 pedal 5 V), MCU and USB, Sensors, Switch inputs, Outputs (low-side sheets INJ/LS1-LS4 nested here, throttle, TGV, fuel pump), Comms (LSU 4.9 WBO, K-line, CAN), Aux and expansion (J3, spares, proto area). Each sheet opens with a note on what it holds and why.

Labels that name a net are global labels (pointing away from their wire); descriptive labels on power nets stay local so GND keeps its name. tools/options_table.py generates the option-parts table in documents/README.md from the schematic.

Verified: connectivity and every net name identical to the flat schematic (167 nets), in KiCad 10 and KiCad 8.0.7; 0 text overlaps on all 10 sheet files; ERC unchanged (no-connects added on unused USB-C SBU and MCU USBID); pinout check 99 OK.

Co-Authored-By: Claude Opus 5.5 <noreply@anthropic.com>
</commit_message>
<xml_diff>
--- a/documents/STI2004-pinout-findings.docx
+++ b/documents/STI2004-pinout-findings.docx
@@ -336,6 +336,396 @@
     <w:p>
       <w:r>
         <w:t xml:space="preserve">J1 pin order: pins 1-31 are B137 (D1-D31), 32-66 are B136 (C1-C35), 67-101 are B135 (B1-B35), 102-135 are B134 (A1-A34).</w:t>
+      </w:r>
+    </w:p>
+    <w:p>
+      <w:pPr>
+        <w:pStyle w:val="Heading2"/>
+      </w:pPr>
+      <w:r>
+        <w:t xml:space="preserve">Schematic sheets</w:t>
+      </w:r>
+    </w:p>
+    <w:p>
+      <w:r>
+        <w:t xml:space="preserve">The schematic is split by function (root page </w:t>
+      </w:r>
+      <w:r>
+        <w:rPr>
+          <w:rFonts w:ascii="Courier New" w:hAnsi="Courier New"/>
+        </w:rPr>
+        <w:t xml:space="preserve">rusefiSTI2004.kicad_sch</w:t>
+      </w:r>
+      <w:r>
+        <w:t xml:space="preserve"> shows the blocks). Every sheet starts with a note on what it holds and why. Signals between sheets are global net labels; power symbols are global.</w:t>
+      </w:r>
+    </w:p>
+    <w:tbl>
+      <w:tblPr>
+        <w:tblStyle w:val="TableGrid"/>
+        <w:tblW w:w="0" w:type="auto"/>
+        <w:tblLook w:val="04A0" w:firstRow="1" w:lastRow="0" w:firstColumn="1" w:lastColumn="0" w:noHBand="0" w:noVBand="1"/>
+      </w:tblPr>
+      <w:tblGrid>
+        <w:gridCol w:w="3120"/>
+        <w:gridCol w:w="3120"/>
+        <w:gridCol w:w="3120"/>
+      </w:tblGrid>
+      <w:tr>
+        <w:trPr>
+          <w:tblHeader/>
+        </w:trPr>
+        <w:tc>
+          <w:tcPr>
+            <w:tcW w:w="3120" w:type="dxa"/>
+          </w:tcPr>
+          <w:p>
+            <w:r>
+              <w:t xml:space="preserve">Sheet</w:t>
+            </w:r>
+          </w:p>
+        </w:tc>
+        <w:tc>
+          <w:tcPr>
+            <w:tcW w:w="3120" w:type="dxa"/>
+          </w:tcPr>
+          <w:p>
+            <w:r>
+              <w:t xml:space="preserve">File</w:t>
+            </w:r>
+          </w:p>
+        </w:tc>
+        <w:tc>
+          <w:tcPr>
+            <w:tcW w:w="3120" w:type="dxa"/>
+          </w:tcPr>
+          <w:p>
+            <w:r>
+              <w:t xml:space="preserve">Holds</w:t>
+            </w:r>
+          </w:p>
+        </w:tc>
+      </w:tr>
+      <w:tr>
+        <w:tc>
+          <w:tcPr>
+            <w:tcW w:w="3120" w:type="dxa"/>
+          </w:tcPr>
+          <w:p>
+            <w:r>
+              <w:t xml:space="preserve">Vehicle connector</w:t>
+            </w:r>
+          </w:p>
+        </w:tc>
+        <w:tc>
+          <w:tcPr>
+            <w:tcW w:w="3120" w:type="dxa"/>
+          </w:tcPr>
+          <w:p>
+            <w:r>
+              <w:rPr>
+                <w:rFonts w:ascii="Courier New" w:hAnsi="Courier New"/>
+              </w:rPr>
+              <w:t xml:space="preserve">Connector.kicad_sch</w:t>
+            </w:r>
+          </w:p>
+        </w:tc>
+        <w:tc>
+          <w:tcPr>
+            <w:tcW w:w="3120" w:type="dxa"/>
+          </w:tcPr>
+          <w:p>
+            <w:r>
+              <w:t xml:space="preserve">J1, all four ECM plugs (D=B137, C=B136, B=B135, A=B134), coil-line fuses, battery divider</w:t>
+            </w:r>
+          </w:p>
+        </w:tc>
+      </w:tr>
+      <w:tr>
+        <w:tc>
+          <w:tcPr>
+            <w:tcW w:w="3120" w:type="dxa"/>
+          </w:tcPr>
+          <w:p>
+            <w:r>
+              <w:t xml:space="preserve">Power</w:t>
+            </w:r>
+          </w:p>
+        </w:tc>
+        <w:tc>
+          <w:tcPr>
+            <w:tcW w:w="3120" w:type="dxa"/>
+          </w:tcPr>
+          <w:p>
+            <w:r>
+              <w:rPr>
+                <w:rFonts w:ascii="Courier New" w:hAnsi="Courier New"/>
+              </w:rPr>
+              <w:t xml:space="preserve">Power.kicad_sch</w:t>
+            </w:r>
+          </w:p>
+        </w:tc>
+        <w:tc>
+          <w:tcPr>
+            <w:tcW w:w="3120" w:type="dxa"/>
+          </w:tcPr>
+          <w:p>
+            <w:r>
+              <w:t xml:space="preserve">M14 main power module, M8 pedal-only 5 V</w:t>
+            </w:r>
+          </w:p>
+        </w:tc>
+      </w:tr>
+      <w:tr>
+        <w:tc>
+          <w:tcPr>
+            <w:tcW w:w="3120" w:type="dxa"/>
+          </w:tcPr>
+          <w:p>
+            <w:r>
+              <w:t xml:space="preserve">MCU and USB</w:t>
+            </w:r>
+          </w:p>
+        </w:tc>
+        <w:tc>
+          <w:tcPr>
+            <w:tcW w:w="3120" w:type="dxa"/>
+          </w:tcPr>
+          <w:p>
+            <w:r>
+              <w:rPr>
+                <w:rFonts w:ascii="Courier New" w:hAnsi="Courier New"/>
+              </w:rPr>
+              <w:t xml:space="preserve">Mcu.kicad_sch</w:t>
+            </w:r>
+          </w:p>
+        </w:tc>
+        <w:tc>
+          <w:tcPr>
+            <w:tcW w:w="3120" w:type="dxa"/>
+          </w:tcPr>
+          <w:p>
+            <w:r>
+              <w:t xml:space="preserve">M1 STM32F7 module, USB-C with ESD, BOOT0 and SWD</w:t>
+            </w:r>
+          </w:p>
+        </w:tc>
+      </w:tr>
+      <w:tr>
+        <w:tc>
+          <w:tcPr>
+            <w:tcW w:w="3120" w:type="dxa"/>
+          </w:tcPr>
+          <w:p>
+            <w:r>
+              <w:t xml:space="preserve">Sensors</w:t>
+            </w:r>
+          </w:p>
+        </w:tc>
+        <w:tc>
+          <w:tcPr>
+            <w:tcW w:w="3120" w:type="dxa"/>
+          </w:tcPr>
+          <w:p>
+            <w:r>
+              <w:rPr>
+                <w:rFonts w:ascii="Courier New" w:hAnsi="Courier New"/>
+              </w:rPr>
+              <w:t xml:space="preserve">Sensors.kicad_sch</w:t>
+            </w:r>
+          </w:p>
+        </w:tc>
+        <w:tc>
+          <w:tcPr>
+            <w:tcW w:w="3120" w:type="dxa"/>
+          </w:tcPr>
+          <w:p>
+            <w:r>
+              <w:t xml:space="preserve">crank VR (M5), knock (M13, spare M7), cam pull-up options, sensor-ground selection</w:t>
+            </w:r>
+          </w:p>
+        </w:tc>
+      </w:tr>
+      <w:tr>
+        <w:tc>
+          <w:tcPr>
+            <w:tcW w:w="3120" w:type="dxa"/>
+          </w:tcPr>
+          <w:p>
+            <w:r>
+              <w:t xml:space="preserve">Switch inputs</w:t>
+            </w:r>
+          </w:p>
+        </w:tc>
+        <w:tc>
+          <w:tcPr>
+            <w:tcW w:w="3120" w:type="dxa"/>
+          </w:tcPr>
+          <w:p>
+            <w:r>
+              <w:rPr>
+                <w:rFonts w:ascii="Courier New" w:hAnsi="Courier New"/>
+              </w:rPr>
+              <w:t xml:space="preserve">Inputs.kicad_sch</w:t>
+            </w:r>
+          </w:p>
+        </w:tc>
+        <w:tc>
+          <w:tcPr>
+            <w:tcW w:w="3120" w:type="dxa"/>
+          </w:tcPr>
+          <w:p>
+            <w:r>
+              <w:t xml:space="preserve">dinput4 modules (M11, M12), pull-downs and pull-up options for every switch</w:t>
+            </w:r>
+          </w:p>
+        </w:tc>
+      </w:tr>
+      <w:tr>
+        <w:tc>
+          <w:tcPr>
+            <w:tcW w:w="3120" w:type="dxa"/>
+          </w:tcPr>
+          <w:p>
+            <w:r>
+              <w:t xml:space="preserve">Outputs</w:t>
+            </w:r>
+          </w:p>
+        </w:tc>
+        <w:tc>
+          <w:tcPr>
+            <w:tcW w:w="3120" w:type="dxa"/>
+          </w:tcPr>
+          <w:p>
+            <w:r>
+              <w:rPr>
+                <w:rFonts w:ascii="Courier New" w:hAnsi="Courier New"/>
+              </w:rPr>
+              <w:t xml:space="preserve">Outputs.kicad_sch</w:t>
+            </w:r>
+          </w:p>
+        </w:tc>
+        <w:tc>
+          <w:tcPr>
+            <w:tcW w:w="3120" w:type="dxa"/>
+          </w:tcPr>
+          <w:p>
+            <w:r>
+              <w:t xml:space="preserve">low-side driver sheets (INJ, LS1-LS4 in </w:t>
+            </w:r>
+            <w:r>
+              <w:rPr>
+                <w:rFonts w:ascii="Courier New" w:hAnsi="Courier New"/>
+              </w:rPr>
+              <w:t xml:space="preserve">INJ4.kicad_sch</w:t>
+            </w:r>
+            <w:r>
+              <w:t xml:space="preserve">), throttle (M2), TGV (M9), fuel pump options</w:t>
+            </w:r>
+          </w:p>
+        </w:tc>
+      </w:tr>
+      <w:tr>
+        <w:tc>
+          <w:tcPr>
+            <w:tcW w:w="3120" w:type="dxa"/>
+          </w:tcPr>
+          <w:p>
+            <w:r>
+              <w:t xml:space="preserve">Comms</w:t>
+            </w:r>
+          </w:p>
+        </w:tc>
+        <w:tc>
+          <w:tcPr>
+            <w:tcW w:w="3120" w:type="dxa"/>
+          </w:tcPr>
+          <w:p>
+            <w:r>
+              <w:rPr>
+                <w:rFonts w:ascii="Courier New" w:hAnsi="Courier New"/>
+              </w:rPr>
+              <w:t xml:space="preserve">Comms.kicad_sch</w:t>
+            </w:r>
+          </w:p>
+        </w:tc>
+        <w:tc>
+          <w:tcPr>
+            <w:tcW w:w="3120" w:type="dxa"/>
+          </w:tcPr>
+          <w:p>
+            <w:r>
+              <w:t xml:space="preserve">LSU 4.9 wideband (M3), K-line (M10), CAN</w:t>
+            </w:r>
+          </w:p>
+        </w:tc>
+      </w:tr>
+      <w:tr>
+        <w:tc>
+          <w:tcPr>
+            <w:tcW w:w="3120" w:type="dxa"/>
+          </w:tcPr>
+          <w:p>
+            <w:r>
+              <w:t xml:space="preserve">Aux and expansion</w:t>
+            </w:r>
+          </w:p>
+        </w:tc>
+        <w:tc>
+          <w:tcPr>
+            <w:tcW w:w="3120" w:type="dxa"/>
+          </w:tcPr>
+          <w:p>
+            <w:r>
+              <w:rPr>
+                <w:rFonts w:ascii="Courier New" w:hAnsi="Courier New"/>
+              </w:rPr>
+              <w:t xml:space="preserve">Aux.kicad_sch</w:t>
+            </w:r>
+          </w:p>
+        </w:tc>
+        <w:tc>
+          <w:tcPr>
+            <w:tcW w:w="3120" w:type="dxa"/>
+          </w:tcPr>
+          <w:p>
+            <w:r>
+              <w:t xml:space="preserve">J3 Mini-Fit Jr, its fuses, spare pins and rails on pads, prototype area</w:t>
+            </w:r>
+          </w:p>
+        </w:tc>
+      </w:tr>
+    </w:tbl>
+    <w:p>
+      <w:r>
+        <w:t xml:space="preserve">Checks: </w:t>
+      </w:r>
+      <w:r>
+        <w:rPr>
+          <w:rFonts w:ascii="Courier New" w:hAnsi="Courier New"/>
+        </w:rPr>
+        <w:t xml:space="preserve">python3 tools/sch_overlap_check.py &lt;sheet&gt;.kicad_sch</w:t>
+      </w:r>
+      <w:r>
+        <w:t xml:space="preserve"> (no text may overlap), </w:t>
+      </w:r>
+      <w:r>
+        <w:rPr>
+          <w:rFonts w:ascii="Courier New" w:hAnsi="Courier New"/>
+        </w:rPr>
+        <w:t xml:space="preserve">python3 tools/pinout_check.py</w:t>
+      </w:r>
+      <w:r>
+        <w:t xml:space="preserve"> (car pinout), </w:t>
+      </w:r>
+      <w:r>
+        <w:rPr>
+          <w:rFonts w:ascii="Courier New" w:hAnsi="Courier New"/>
+        </w:rPr>
+        <w:t xml:space="preserve">python3 tools/options_table.py</w:t>
+      </w:r>
+      <w:r>
+        <w:t xml:space="preserve"> (option list).</w:t>
       </w:r>
     </w:p>
     <w:p>
@@ -1454,7 +1844,7 @@
     </w:p>
     <w:p>
       <w:r>
-        <w:t xml:space="preserve">| C7 / C10 / C11 | Cruise main / resume / set (12 V when pressed) | IN_D1 / IN_D3 / IN_D4 | R35-R37 1k 1206 pull-downs | | A15 / A16 | Cruise main lamp / set lamp | OUT_IO5 / OUT_IO6 -&gt; Q17 / Q18 | sheet LS4 | | D20 | K-line (SSM) | M10 LIN module, UART8 TX/RX | | | A2+A3, A33, A26, A25 | LSU 4.9 (see below) | M3 WBO module, CAN to M1 CANH/CANL | | | D11 / D12 / D13 / D14 | Defogger / small lights / blower (A/C) / test mode | M11 dinput4 -&gt; IO5 / IO6 / IO7 / OUT_IO13 | close to ground; 680k pull-up to 5 V, R49-R51 10k options | | D24 | Blow-by (PCV) diagnosis | M12 dinput4 ch4 -&gt; OUT_INJ8 | | | aux pads P29-P31 | AUX_IN1-3: launch / 2-step button, map switch, spare | M12 dinput4 ch1-3 -&gt; OUT_IO9 / OUT_IO10 / OUT_IO11 | expect 12 V when pressed; 680k pull-down, R46-R48 4.7k options | | USB J2 (mini-B) | TunerStudio | M1 USB D+/D-/VBUS/ID | |</w:t>
+        <w:t xml:space="preserve">| C7 / C10 / C11 | Cruise main / resume / set (12 V when pressed) | IN_D1 / IN_D3 / IN_D4 | R35-R37 1k 1206 pull-downs | | A15 / A16 | Cruise main lamp / set lamp | OUT_IO5 / OUT_IO6 -&gt; Q17 / Q18 | sheet LS4 | | D20 | K-line (SSM) | M10 LIN module, UART8 TX/RX | | | A2+A3, A33, A26, A25 | LSU 4.9 (see below) | M3 WBO module, CAN to M1 CANH/CANL | | | D11 / D12 / D13 / D14 | Defogger / small lights / blower (A/C) / test mode | M11 dinput4 -&gt; IO5 / IO6 / IO7 / OUT_IO13 | close to ground; 680k pull-up to 5 V, R51-R53 10k options | | D24 | Blow-by (PCV) diagnosis | M12 dinput4 ch4 -&gt; OUT_INJ8 | | | aux pads P29-P31 | AUX_IN1-3: launch / 2-step button, map switch, spare | M12 dinput4 ch1-3 -&gt; OUT_IO9 / OUT_IO10 / OUT_IO11 | expect 12 V when pressed; 680k pull-down, R48-R50 4.7k options | | USB J2 (USB-C) | TunerStudio | M1 USB D+/D-/VBUS | ESD U1 |</w:t>
       </w:r>
     </w:p>
     <w:p>
@@ -1791,7 +2181,7 @@
         <w:t xml:space="preserve">No USB.</w:t>
       </w:r>
       <w:r>
-        <w:t xml:space="preserve"> J2 mini-B (vertical, C13453) to the MCU USB pins. BOOT0 pad P23 with open link JP10 to 3.3 V for DFU recovery; SWD pads P24-P26 (SWDIO, SWCLK, NRST).</w:t>
+        <w:t xml:space="preserve"> J2 USB-C (HRO TYPE-C-31-M-12, C165948, the EmbeddedEra library part we already build with) to the MCU USB pins, 5.1k CC pull-downs (device), USBLC6-2SC6 ESD (U1, C7519), shield to GND through a fitted 0R link. BOOT0 pad P23 with open link JP11 to 3.3 V for DFU recovery; SWD pads P24-P26 (SWDIO, SWCLK, NRST).</w:t>
       </w:r>
     </w:p>
     <w:p>
@@ -1857,7 +2247,7 @@
         <w:t xml:space="preserve">Pedal 5 V is now its own rail.</w:t>
       </w:r>
       <w:r>
-        <w:t xml:space="preserve"> The pedal supply C15 (net APS_PS_5V) comes from the second power module M8's protected 5 V; the throttle/MAP/TGV sensor supply C16 stays on M14 (+5VAS). A shared rail would let one short take out both pedal and throttle sensors and defeat their plausibility check. JP11 (open) puts the pedal back on +5VAS if M8 is not fitted; M8's power-good is on pad P32.</w:t>
+        <w:t xml:space="preserve"> The pedal supply C15 (net APS_PS_5V) comes from the second power module M8's protected 5 V; the throttle/MAP/TGV sensor supply C16 stays on M14 (+5VAS). A shared rail would let one short take out both pedal and throttle sensors and defeat their plausibility check. JP12 (open) puts the pedal back on +5VAS if M8 is not fitted; M8's power-good is on pad P32.</w:t>
       </w:r>
     </w:p>
     <w:p>
@@ -1875,7 +2265,7 @@
         <w:t xml:space="preserve">CAN termination:</w:t>
       </w:r>
       <w:r>
-        <w:t xml:space="preserve"> M1 already has 120R across CANH/CANL (R100 on mega-mcu144 sheet 15); the WBO module has none. R52 (120R, DNP) at the aux connector terminates the far end if an external device on the aux CAN does not.</w:t>
+        <w:t xml:space="preserve"> M1 already has 120R across CANH/CANL (R100 on mega-mcu144 sheet 15); the WBO module has none. R54 (120R, DNP) at the aux connector terminates the far end if an external device on the aux CAN does not.</w:t>
       </w:r>
     </w:p>
     <w:p>
@@ -2266,7 +2656,7 @@
     </w:tbl>
     <w:p>
       <w:r>
-        <w:t xml:space="preserve">AUX_IN1-3 expect a switch to 12 V (680k pull-down on the dinput4, R46-R48 4.7k options). AUX_AN2 shares IN_AT2 with the FPCU status option JP7: fit only one. AUX_OUT1/2 also reach EVAP A12/A13 through open JP5/JP6.</w:t>
+        <w:t xml:space="preserve">AUX_IN1-3 expect a switch to 12 V (680k pull-down on the dinput4, R48-R50 4.7k options). AUX_AN2 shares IN_AT2 with the FPCU status option JP7: fit only one. AUX_OUT1/2 also reach EVAP A12/A13 through open JP5/JP6.</w:t>
       </w:r>
     </w:p>
     <w:p>
@@ -2274,12 +2664,21 @@
         <w:pStyle w:val="Heading3"/>
       </w:pPr>
       <w:r>
-        <w:t xml:space="preserve">Option parts (footprints on the board, not assembled)</w:t>
-      </w:r>
-    </w:p>
-    <w:p>
-      <w:r>
-        <w:t xml:space="preserve">Listed in </w:t>
+        <w:t xml:space="preserve">Option parts (footprints on the board)</w:t>
+      </w:r>
+    </w:p>
+    <w:p>
+      <w:r>
+        <w:t xml:space="preserve">Generated from the schematic by </w:t>
+      </w:r>
+      <w:r>
+        <w:rPr>
+          <w:rFonts w:ascii="Courier New" w:hAnsi="Courier New"/>
+        </w:rPr>
+        <w:t xml:space="preserve">python3 tools/options_table.py</w:t>
+      </w:r>
+      <w:r>
+        <w:t xml:space="preserve"> (re-run after any change). "Not fitted" parts are marked DNP in KiCad and listed in </w:t>
       </w:r>
       <w:r>
         <w:rPr>
@@ -2288,7 +2687,7 @@
         <w:t xml:space="preserve">bom_replace_rusefiSTI2004-a.csv</w:t>
       </w:r>
       <w:r>
-        <w:t xml:space="preserve"> (Hellen's removal list) and marked DNP in KiCad. Fit one by deleting its line.</w:t>
+        <w:t xml:space="preserve">, Hellen's removal list: delete a part's line there to have it assembled.</w:t>
       </w:r>
     </w:p>
     <w:tbl>
@@ -2298,9 +2697,12 @@
         <w:tblLook w:val="04A0" w:firstRow="1" w:lastRow="0" w:firstColumn="1" w:lastColumn="0" w:noHBand="0" w:noVBand="1"/>
       </w:tblPr>
       <w:tblGrid>
-        <w:gridCol w:w="3120"/>
-        <w:gridCol w:w="3120"/>
-        <w:gridCol w:w="3120"/>
+        <w:gridCol w:w="1560"/>
+        <w:gridCol w:w="1560"/>
+        <w:gridCol w:w="1560"/>
+        <w:gridCol w:w="1560"/>
+        <w:gridCol w:w="1560"/>
+        <w:gridCol w:w="1560"/>
       </w:tblGrid>
       <w:tr>
         <w:trPr>
@@ -2308,7 +2710,17 @@
         </w:trPr>
         <w:tc>
           <w:tcPr>
-            <w:tcW w:w="3120" w:type="dxa"/>
+            <w:tcW w:w="1560" w:type="dxa"/>
+          </w:tcPr>
+          <w:p>
+            <w:r>
+              <w:t xml:space="preserve">Sheet</w:t>
+            </w:r>
+          </w:p>
+        </w:tc>
+        <w:tc>
+          <w:tcPr>
+            <w:tcW w:w="1560" w:type="dxa"/>
           </w:tcPr>
           <w:p>
             <w:r>
@@ -2318,131 +2730,59 @@
         </w:tc>
         <w:tc>
           <w:tcPr>
-            <w:tcW w:w="3120" w:type="dxa"/>
-          </w:tcPr>
-          <w:p>
-            <w:r>
-              <w:t xml:space="preserve">Option</w:t>
-            </w:r>
-          </w:p>
-        </w:tc>
-        <w:tc>
-          <w:tcPr>
-            <w:tcW w:w="3120" w:type="dxa"/>
-          </w:tcPr>
-          <w:p>
-            <w:r>
-              <w:t xml:space="preserve">When to fit</w:t>
-            </w:r>
-          </w:p>
-        </w:tc>
-      </w:tr>
-      <w:tr>
-        <w:tc>
-          <w:tcPr>
-            <w:tcW w:w="3120" w:type="dxa"/>
-          </w:tcPr>
-          <w:p>
-            <w:r>
-              <w:t xml:space="preserve">R38 2.2k 0805</w:t>
-            </w:r>
-          </w:p>
-        </w:tc>
-        <w:tc>
-          <w:tcPr>
-            <w:tcW w:w="3120" w:type="dxa"/>
-          </w:tcPr>
-          <w:p>
-            <w:r>
-              <w:t xml:space="preserve">Tach A23 pull-up to +12V_RAW</w:t>
-            </w:r>
-          </w:p>
-        </w:tc>
-        <w:tc>
-          <w:tcPr>
-            <w:tcW w:w="3120" w:type="dxa"/>
-          </w:tcPr>
-          <w:p>
-            <w:r>
-              <w:t xml:space="preserve">tach needle dead</w:t>
-            </w:r>
-          </w:p>
-        </w:tc>
-      </w:tr>
-      <w:tr>
-        <w:tc>
-          <w:tcPr>
-            <w:tcW w:w="3120" w:type="dxa"/>
-          </w:tcPr>
-          <w:p>
-            <w:r>
-              <w:t xml:space="preserve">R39 100R</w:t>
-            </w:r>
-          </w:p>
-        </w:tc>
-        <w:tc>
-          <w:tcPr>
-            <w:tcW w:w="3120" w:type="dxa"/>
-          </w:tcPr>
-          <w:p>
-            <w:r>
-              <w:rPr>
-                <w:i/>
-              </w:rPr>
-              <w:t xml:space="preserve">Fitted</w:t>
-            </w:r>
-            <w:r>
-              <w:t xml:space="preserve">: series resistor on the FPCU command</w:t>
-            </w:r>
-          </w:p>
-        </w:tc>
-        <w:tc>
-          <w:tcPr>
-            <w:tcW w:w="3120" w:type="dxa"/>
-          </w:tcPr>
-          <w:p>
-            <w:r>
-              <w:t xml:space="preserve">always</w:t>
-            </w:r>
-          </w:p>
-        </w:tc>
-      </w:tr>
-      <w:tr>
-        <w:tc>
-          <w:tcPr>
-            <w:tcW w:w="3120" w:type="dxa"/>
-          </w:tcPr>
-          <w:p>
-            <w:r>
-              <w:t xml:space="preserve">R40 1k / R41 10k</w:t>
-            </w:r>
-          </w:p>
-        </w:tc>
-        <w:tc>
-          <w:tcPr>
-            <w:tcW w:w="3120" w:type="dxa"/>
-          </w:tcPr>
-          <w:p>
-            <w:r>
-              <w:t xml:space="preserve">FPCU command B26 pull-up to 5 V / pull-down</w:t>
-            </w:r>
-          </w:p>
-        </w:tc>
-        <w:tc>
-          <w:tcPr>
-            <w:tcW w:w="3120" w:type="dxa"/>
-          </w:tcPr>
-          <w:p>
-            <w:r>
-              <w:t xml:space="preserve">if the FPCU input needs it (scope the stock ECM first)</w:t>
-            </w:r>
-          </w:p>
-        </w:tc>
-      </w:tr>
-      <w:tr>
-        <w:tc>
-          <w:tcPr>
-            <w:tcW w:w="3120" w:type="dxa"/>
+            <w:tcW w:w="1560" w:type="dxa"/>
+          </w:tcPr>
+          <w:p>
+            <w:r>
+              <w:t xml:space="preserve">Value</w:t>
+            </w:r>
+          </w:p>
+        </w:tc>
+        <w:tc>
+          <w:tcPr>
+            <w:tcW w:w="1560" w:type="dxa"/>
+          </w:tcPr>
+          <w:p>
+            <w:r>
+              <w:t xml:space="preserve">Joins</w:t>
+            </w:r>
+          </w:p>
+        </w:tc>
+        <w:tc>
+          <w:tcPr>
+            <w:tcW w:w="1560" w:type="dxa"/>
+          </w:tcPr>
+          <w:p>
+            <w:r>
+              <w:t xml:space="preserve">Default</w:t>
+            </w:r>
+          </w:p>
+        </w:tc>
+        <w:tc>
+          <w:tcPr>
+            <w:tcW w:w="1560" w:type="dxa"/>
+          </w:tcPr>
+          <w:p>
+            <w:r>
+              <w:t xml:space="preserve">When to fit / remove</w:t>
+            </w:r>
+          </w:p>
+        </w:tc>
+      </w:tr>
+      <w:tr>
+        <w:tc>
+          <w:tcPr>
+            <w:tcW w:w="1560" w:type="dxa"/>
+          </w:tcPr>
+          <w:p>
+            <w:r>
+              <w:t xml:space="preserve">Aux</w:t>
+            </w:r>
+          </w:p>
+        </w:tc>
+        <w:tc>
+          <w:tcPr>
+            <w:tcW w:w="1560" w:type="dxa"/>
           </w:tcPr>
           <w:p>
             <w:r>
@@ -2452,125 +2792,431 @@
         </w:tc>
         <w:tc>
           <w:tcPr>
-            <w:tcW w:w="3120" w:type="dxa"/>
-          </w:tcPr>
-          <w:p>
-            <w:r>
-              <w:t xml:space="preserve">D28 FPCU status -&gt; IN_AT2</w:t>
-            </w:r>
-          </w:p>
-        </w:tc>
-        <w:tc>
-          <w:tcPr>
-            <w:tcW w:w="3120" w:type="dxa"/>
-          </w:tcPr>
-          <w:p>
-            <w:r>
-              <w:t xml:space="preserve">to read pump status (then do not use AUX_AN2)</w:t>
-            </w:r>
-          </w:p>
-        </w:tc>
-      </w:tr>
-      <w:tr>
-        <w:tc>
-          <w:tcPr>
-            <w:tcW w:w="3120" w:type="dxa"/>
-          </w:tcPr>
-          <w:p>
-            <w:r>
-              <w:t xml:space="preserve">R42 / R43 1k</w:t>
-            </w:r>
-          </w:p>
-        </w:tc>
-        <w:tc>
-          <w:tcPr>
-            <w:tcW w:w="3120" w:type="dxa"/>
-          </w:tcPr>
-          <w:p>
-            <w:r>
-              <w:t xml:space="preserve">Extra pull-ups on cam LH / RH</w:t>
-            </w:r>
-          </w:p>
-        </w:tc>
-        <w:tc>
-          <w:tcPr>
-            <w:tcW w:w="3120" w:type="dxa"/>
-          </w:tcPr>
-          <w:p>
-            <w:r>
-              <w:t xml:space="preserve">weak or noisy cam signal</w:t>
-            </w:r>
-          </w:p>
-        </w:tc>
-      </w:tr>
-      <w:tr>
-        <w:tc>
-          <w:tcPr>
-            <w:tcW w:w="3120" w:type="dxa"/>
-          </w:tcPr>
-          <w:p>
-            <w:r>
-              <w:t xml:space="preserve">R44 4.7k</w:t>
-            </w:r>
-          </w:p>
-        </w:tc>
-        <w:tc>
-          <w:tcPr>
-            <w:tcW w:w="3120" w:type="dxa"/>
-          </w:tcPr>
-          <w:p>
-            <w:r>
-              <w:t xml:space="preserve">Neutral switch pull-down</w:t>
-            </w:r>
-          </w:p>
-        </w:tc>
-        <w:tc>
-          <w:tcPr>
-            <w:tcW w:w="3120" w:type="dxa"/>
-          </w:tcPr>
-          <w:p>
-            <w:r>
-              <w:t xml:space="preserve">if neutral turns out to be 12 V-active</w:t>
-            </w:r>
-          </w:p>
-        </w:tc>
-      </w:tr>
-      <w:tr>
-        <w:tc>
-          <w:tcPr>
-            <w:tcW w:w="3120" w:type="dxa"/>
-          </w:tcPr>
-          <w:p>
-            <w:r>
-              <w:t xml:space="preserve">R45 1k</w:t>
-            </w:r>
-          </w:p>
-        </w:tc>
-        <w:tc>
-          <w:tcPr>
-            <w:tcW w:w="3120" w:type="dxa"/>
-          </w:tcPr>
-          <w:p>
-            <w:r>
-              <w:t xml:space="preserve">Fuel level pull-up</w:t>
-            </w:r>
-          </w:p>
-        </w:tc>
-        <w:tc>
-          <w:tcPr>
-            <w:tcW w:w="3120" w:type="dxa"/>
-          </w:tcPr>
-          <w:p>
-            <w:r>
-              <w:t xml:space="preserve">to tune the fuel gauge reading</w:t>
-            </w:r>
-          </w:p>
-        </w:tc>
-      </w:tr>
-      <w:tr>
-        <w:tc>
-          <w:tcPr>
-            <w:tcW w:w="3120" w:type="dxa"/>
+            <w:tcW w:w="1560" w:type="dxa"/>
+          </w:tcPr>
+          <w:p>
+            <w:r>
+              <w:t xml:space="preserve">DNP 0R</w:t>
+            </w:r>
+          </w:p>
+        </w:tc>
+        <w:tc>
+          <w:tcPr>
+            <w:tcW w:w="1560" w:type="dxa"/>
+          </w:tcPr>
+          <w:p>
+            <w:r>
+              <w:t xml:space="preserve">AUX_AN2 / FP_STATUS</w:t>
+            </w:r>
+          </w:p>
+        </w:tc>
+        <w:tc>
+          <w:tcPr>
+            <w:tcW w:w="1560" w:type="dxa"/>
+          </w:tcPr>
+          <w:p>
+            <w:r>
+              <w:t xml:space="preserve">not fitted</w:t>
+            </w:r>
+          </w:p>
+        </w:tc>
+        <w:tc>
+          <w:tcPr>
+            <w:tcW w:w="1560" w:type="dxa"/>
+          </w:tcPr>
+          <w:p>
+            <w:r>
+              <w:t xml:space="preserve">read the FPCU status on IN_AT2 (then do not use AUX_AN2)</w:t>
+            </w:r>
+          </w:p>
+        </w:tc>
+      </w:tr>
+      <w:tr>
+        <w:tc>
+          <w:tcPr>
+            <w:tcW w:w="1560" w:type="dxa"/>
+          </w:tcPr>
+          <w:p>
+            <w:r>
+              <w:t xml:space="preserve">Aux</w:t>
+            </w:r>
+          </w:p>
+        </w:tc>
+        <w:tc>
+          <w:tcPr>
+            <w:tcW w:w="1560" w:type="dxa"/>
+          </w:tcPr>
+          <w:p>
+            <w:r>
+              <w:t xml:space="preserve">R48</w:t>
+            </w:r>
+          </w:p>
+        </w:tc>
+        <w:tc>
+          <w:tcPr>
+            <w:tcW w:w="1560" w:type="dxa"/>
+          </w:tcPr>
+          <w:p>
+            <w:r>
+              <w:t xml:space="preserve">4.7k</w:t>
+            </w:r>
+          </w:p>
+        </w:tc>
+        <w:tc>
+          <w:tcPr>
+            <w:tcW w:w="1560" w:type="dxa"/>
+          </w:tcPr>
+          <w:p>
+            <w:r>
+              <w:t xml:space="preserve">AUX_IN1 / GND</w:t>
+            </w:r>
+          </w:p>
+        </w:tc>
+        <w:tc>
+          <w:tcPr>
+            <w:tcW w:w="1560" w:type="dxa"/>
+          </w:tcPr>
+          <w:p>
+            <w:r>
+              <w:t xml:space="preserve">not fitted</w:t>
+            </w:r>
+          </w:p>
+        </w:tc>
+        <w:tc>
+          <w:tcPr>
+            <w:tcW w:w="1560" w:type="dxa"/>
+          </w:tcPr>
+          <w:p>
+            <w:r>
+              <w:t xml:space="preserve">aux input 1 floats: stronger pull-down</w:t>
+            </w:r>
+          </w:p>
+        </w:tc>
+      </w:tr>
+      <w:tr>
+        <w:tc>
+          <w:tcPr>
+            <w:tcW w:w="1560" w:type="dxa"/>
+          </w:tcPr>
+          <w:p>
+            <w:r>
+              <w:t xml:space="preserve">Aux</w:t>
+            </w:r>
+          </w:p>
+        </w:tc>
+        <w:tc>
+          <w:tcPr>
+            <w:tcW w:w="1560" w:type="dxa"/>
+          </w:tcPr>
+          <w:p>
+            <w:r>
+              <w:t xml:space="preserve">R49</w:t>
+            </w:r>
+          </w:p>
+        </w:tc>
+        <w:tc>
+          <w:tcPr>
+            <w:tcW w:w="1560" w:type="dxa"/>
+          </w:tcPr>
+          <w:p>
+            <w:r>
+              <w:t xml:space="preserve">4.7k</w:t>
+            </w:r>
+          </w:p>
+        </w:tc>
+        <w:tc>
+          <w:tcPr>
+            <w:tcW w:w="1560" w:type="dxa"/>
+          </w:tcPr>
+          <w:p>
+            <w:r>
+              <w:t xml:space="preserve">AUX_IN2 / GND</w:t>
+            </w:r>
+          </w:p>
+        </w:tc>
+        <w:tc>
+          <w:tcPr>
+            <w:tcW w:w="1560" w:type="dxa"/>
+          </w:tcPr>
+          <w:p>
+            <w:r>
+              <w:t xml:space="preserve">not fitted</w:t>
+            </w:r>
+          </w:p>
+        </w:tc>
+        <w:tc>
+          <w:tcPr>
+            <w:tcW w:w="1560" w:type="dxa"/>
+          </w:tcPr>
+          <w:p>
+            <w:r>
+              <w:t xml:space="preserve">aux input 2 floats: stronger pull-down</w:t>
+            </w:r>
+          </w:p>
+        </w:tc>
+      </w:tr>
+      <w:tr>
+        <w:tc>
+          <w:tcPr>
+            <w:tcW w:w="1560" w:type="dxa"/>
+          </w:tcPr>
+          <w:p>
+            <w:r>
+              <w:t xml:space="preserve">Aux</w:t>
+            </w:r>
+          </w:p>
+        </w:tc>
+        <w:tc>
+          <w:tcPr>
+            <w:tcW w:w="1560" w:type="dxa"/>
+          </w:tcPr>
+          <w:p>
+            <w:r>
+              <w:t xml:space="preserve">R50</w:t>
+            </w:r>
+          </w:p>
+        </w:tc>
+        <w:tc>
+          <w:tcPr>
+            <w:tcW w:w="1560" w:type="dxa"/>
+          </w:tcPr>
+          <w:p>
+            <w:r>
+              <w:t xml:space="preserve">4.7k</w:t>
+            </w:r>
+          </w:p>
+        </w:tc>
+        <w:tc>
+          <w:tcPr>
+            <w:tcW w:w="1560" w:type="dxa"/>
+          </w:tcPr>
+          <w:p>
+            <w:r>
+              <w:t xml:space="preserve">AUX_IN3 / GND</w:t>
+            </w:r>
+          </w:p>
+        </w:tc>
+        <w:tc>
+          <w:tcPr>
+            <w:tcW w:w="1560" w:type="dxa"/>
+          </w:tcPr>
+          <w:p>
+            <w:r>
+              <w:t xml:space="preserve">not fitted</w:t>
+            </w:r>
+          </w:p>
+        </w:tc>
+        <w:tc>
+          <w:tcPr>
+            <w:tcW w:w="1560" w:type="dxa"/>
+          </w:tcPr>
+          <w:p>
+            <w:r>
+              <w:t xml:space="preserve">aux input 3 floats: stronger pull-down</w:t>
+            </w:r>
+          </w:p>
+        </w:tc>
+      </w:tr>
+      <w:tr>
+        <w:tc>
+          <w:tcPr>
+            <w:tcW w:w="1560" w:type="dxa"/>
+          </w:tcPr>
+          <w:p>
+            <w:r>
+              <w:t xml:space="preserve">Comms</w:t>
+            </w:r>
+          </w:p>
+        </w:tc>
+        <w:tc>
+          <w:tcPr>
+            <w:tcW w:w="1560" w:type="dxa"/>
+          </w:tcPr>
+          <w:p>
+            <w:r>
+              <w:t xml:space="preserve">JP1</w:t>
+            </w:r>
+          </w:p>
+        </w:tc>
+        <w:tc>
+          <w:tcPr>
+            <w:tcW w:w="1560" w:type="dxa"/>
+          </w:tcPr>
+          <w:p>
+            <w:r>
+              <w:t xml:space="preserve">0R</w:t>
+            </w:r>
+          </w:p>
+        </w:tc>
+        <w:tc>
+          <w:tcPr>
+            <w:tcW w:w="1560" w:type="dxa"/>
+          </w:tcPr>
+          <w:p>
+            <w:r>
+              <w:t xml:space="preserve">WBO_UN / WBO_UN_J1</w:t>
+            </w:r>
+          </w:p>
+        </w:tc>
+        <w:tc>
+          <w:tcPr>
+            <w:tcW w:w="1560" w:type="dxa"/>
+          </w:tcPr>
+          <w:p>
+            <w:r>
+              <w:t xml:space="preserve">fitted</w:t>
+            </w:r>
+          </w:p>
+        </w:tc>
+        <w:tc>
+          <w:tcPr>
+            <w:tcW w:w="1560" w:type="dxa"/>
+          </w:tcPr>
+          <w:p>
+            <w:r>
+              <w:t xml:space="preserve">FITTED: LSU Un through the harness (remove for a pigtail on the pads)</w:t>
+            </w:r>
+          </w:p>
+        </w:tc>
+      </w:tr>
+      <w:tr>
+        <w:tc>
+          <w:tcPr>
+            <w:tcW w:w="1560" w:type="dxa"/>
+          </w:tcPr>
+          <w:p>
+            <w:r>
+              <w:t xml:space="preserve">Comms</w:t>
+            </w:r>
+          </w:p>
+        </w:tc>
+        <w:tc>
+          <w:tcPr>
+            <w:tcW w:w="1560" w:type="dxa"/>
+          </w:tcPr>
+          <w:p>
+            <w:r>
+              <w:t xml:space="preserve">JP2</w:t>
+            </w:r>
+          </w:p>
+        </w:tc>
+        <w:tc>
+          <w:tcPr>
+            <w:tcW w:w="1560" w:type="dxa"/>
+          </w:tcPr>
+          <w:p>
+            <w:r>
+              <w:t xml:space="preserve">0R</w:t>
+            </w:r>
+          </w:p>
+        </w:tc>
+        <w:tc>
+          <w:tcPr>
+            <w:tcW w:w="1560" w:type="dxa"/>
+          </w:tcPr>
+          <w:p>
+            <w:r>
+              <w:t xml:space="preserve">WBO_VM / WBO_VM_J1</w:t>
+            </w:r>
+          </w:p>
+        </w:tc>
+        <w:tc>
+          <w:tcPr>
+            <w:tcW w:w="1560" w:type="dxa"/>
+          </w:tcPr>
+          <w:p>
+            <w:r>
+              <w:t xml:space="preserve">fitted</w:t>
+            </w:r>
+          </w:p>
+        </w:tc>
+        <w:tc>
+          <w:tcPr>
+            <w:tcW w:w="1560" w:type="dxa"/>
+          </w:tcPr>
+          <w:p>
+            <w:r>
+              <w:t xml:space="preserve">FITTED: LSU Vm through the harness</w:t>
+            </w:r>
+          </w:p>
+        </w:tc>
+      </w:tr>
+      <w:tr>
+        <w:tc>
+          <w:tcPr>
+            <w:tcW w:w="1560" w:type="dxa"/>
+          </w:tcPr>
+          <w:p>
+            <w:r>
+              <w:t xml:space="preserve">Comms</w:t>
+            </w:r>
+          </w:p>
+        </w:tc>
+        <w:tc>
+          <w:tcPr>
+            <w:tcW w:w="1560" w:type="dxa"/>
+          </w:tcPr>
+          <w:p>
+            <w:r>
+              <w:t xml:space="preserve">JP3</w:t>
+            </w:r>
+          </w:p>
+        </w:tc>
+        <w:tc>
+          <w:tcPr>
+            <w:tcW w:w="1560" w:type="dxa"/>
+          </w:tcPr>
+          <w:p>
+            <w:r>
+              <w:t xml:space="preserve">0R</w:t>
+            </w:r>
+          </w:p>
+        </w:tc>
+        <w:tc>
+          <w:tcPr>
+            <w:tcW w:w="1560" w:type="dxa"/>
+          </w:tcPr>
+          <w:p>
+            <w:r>
+              <w:t xml:space="preserve">WBO_IP / WBO_IP_J1</w:t>
+            </w:r>
+          </w:p>
+        </w:tc>
+        <w:tc>
+          <w:tcPr>
+            <w:tcW w:w="1560" w:type="dxa"/>
+          </w:tcPr>
+          <w:p>
+            <w:r>
+              <w:t xml:space="preserve">fitted</w:t>
+            </w:r>
+          </w:p>
+        </w:tc>
+        <w:tc>
+          <w:tcPr>
+            <w:tcW w:w="1560" w:type="dxa"/>
+          </w:tcPr>
+          <w:p>
+            <w:r>
+              <w:t xml:space="preserve">FITTED: LSU Ip through the harness (A25 shield wire)</w:t>
+            </w:r>
+          </w:p>
+        </w:tc>
+      </w:tr>
+      <w:tr>
+        <w:tc>
+          <w:tcPr>
+            <w:tcW w:w="1560" w:type="dxa"/>
+          </w:tcPr>
+          <w:p>
+            <w:r>
+              <w:t xml:space="preserve">Comms</w:t>
+            </w:r>
+          </w:p>
+        </w:tc>
+        <w:tc>
+          <w:tcPr>
+            <w:tcW w:w="1560" w:type="dxa"/>
           </w:tcPr>
           <w:p>
             <w:r>
@@ -2580,189 +3226,431 @@
         </w:tc>
         <w:tc>
           <w:tcPr>
-            <w:tcW w:w="3120" w:type="dxa"/>
-          </w:tcPr>
-          <w:p>
-            <w:r>
-              <w:t xml:space="preserve">D29 (DLC pin 6) -&gt; K-line</w:t>
-            </w:r>
-          </w:p>
-        </w:tc>
-        <w:tc>
-          <w:tcPr>
-            <w:tcW w:w="3120" w:type="dxa"/>
-          </w:tcPr>
-          <w:p>
-            <w:r>
-              <w:t xml:space="preserve">if D29 is a second K-line</w:t>
-            </w:r>
-          </w:p>
-        </w:tc>
-      </w:tr>
-      <w:tr>
-        <w:tc>
-          <w:tcPr>
-            <w:tcW w:w="3120" w:type="dxa"/>
-          </w:tcPr>
-          <w:p>
-            <w:r>
-              <w:t xml:space="preserve">JP5 / JP6</w:t>
-            </w:r>
-          </w:p>
-        </w:tc>
-        <w:tc>
-          <w:tcPr>
-            <w:tcW w:w="3120" w:type="dxa"/>
-          </w:tcPr>
-          <w:p>
-            <w:r>
-              <w:t xml:space="preserve">Spare low-side LS4 ch3 / ch4 -&gt; EVAP A12 / A13</w:t>
-            </w:r>
-          </w:p>
-        </w:tc>
-        <w:tc>
-          <w:tcPr>
-            <w:tcW w:w="3120" w:type="dxa"/>
-          </w:tcPr>
-          <w:p>
-            <w:r>
-              <w:t xml:space="preserve">to drive the EVAP solenoids</w:t>
-            </w:r>
-          </w:p>
-        </w:tc>
-      </w:tr>
-      <w:tr>
-        <w:tc>
-          <w:tcPr>
-            <w:tcW w:w="3120" w:type="dxa"/>
-          </w:tcPr>
-          <w:p>
-            <w:r>
-              <w:t xml:space="preserve">JP8 (fitted) / JP9</w:t>
-            </w:r>
-          </w:p>
-        </w:tc>
-        <w:tc>
-          <w:tcPr>
-            <w:tcW w:w="3120" w:type="dxa"/>
-          </w:tcPr>
-          <w:p>
-            <w:r>
-              <w:t xml:space="preserve">Sensor ground GND_SENSOR (C31, C34, C35) -&gt; GND / -&gt; GNDA</w:t>
-            </w:r>
-          </w:p>
-        </w:tc>
-        <w:tc>
-          <w:tcPr>
-            <w:tcW w:w="3120" w:type="dxa"/>
-          </w:tcPr>
-          <w:p>
-            <w:r>
-              <w:t xml:space="preserve">move sensor returns to analog ground</w:t>
-            </w:r>
-          </w:p>
-        </w:tc>
-      </w:tr>
-      <w:tr>
-        <w:tc>
-          <w:tcPr>
-            <w:tcW w:w="3120" w:type="dxa"/>
-          </w:tcPr>
-          <w:p>
-            <w:r>
-              <w:t xml:space="preserve">R30-R37</w:t>
-            </w:r>
-          </w:p>
-        </w:tc>
-        <w:tc>
-          <w:tcPr>
-            <w:tcW w:w="3120" w:type="dxa"/>
-          </w:tcPr>
-          <w:p>
-            <w:r>
-              <w:t xml:space="preserve">Pull-down values (fitted)</w:t>
-            </w:r>
-          </w:p>
-        </w:tc>
-        <w:tc>
-          <w:tcPr>
-            <w:tcW w:w="3120" w:type="dxa"/>
-          </w:tcPr>
-          <w:p>
-            <w:r>
-              <w:t xml:space="preserve">change the value if a switch reads wrong</w:t>
-            </w:r>
-          </w:p>
-        </w:tc>
-      </w:tr>
-      <w:tr>
-        <w:tc>
-          <w:tcPr>
-            <w:tcW w:w="3120" w:type="dxa"/>
-          </w:tcPr>
-          <w:p>
-            <w:r>
-              <w:t xml:space="preserve">R46-R48 4.7k</w:t>
-            </w:r>
-          </w:p>
-        </w:tc>
-        <w:tc>
-          <w:tcPr>
-            <w:tcW w:w="3120" w:type="dxa"/>
-          </w:tcPr>
-          <w:p>
-            <w:r>
-              <w:t xml:space="preserve">Aux input pull-downs</w:t>
-            </w:r>
-          </w:p>
-        </w:tc>
-        <w:tc>
-          <w:tcPr>
-            <w:tcW w:w="3120" w:type="dxa"/>
-          </w:tcPr>
-          <w:p>
-            <w:r>
-              <w:t xml:space="preserve">if an aux button input floats</w:t>
-            </w:r>
-          </w:p>
-        </w:tc>
-      </w:tr>
-      <w:tr>
-        <w:tc>
-          <w:tcPr>
-            <w:tcW w:w="3120" w:type="dxa"/>
-          </w:tcPr>
-          <w:p>
-            <w:r>
-              <w:t xml:space="preserve">R49-R51 10k</w:t>
-            </w:r>
-          </w:p>
-        </w:tc>
-        <w:tc>
-          <w:tcPr>
-            <w:tcW w:w="3120" w:type="dxa"/>
-          </w:tcPr>
-          <w:p>
-            <w:r>
-              <w:t xml:space="preserve">Pull-ups on defogger / lights / blower lines</w:t>
-            </w:r>
-          </w:p>
-        </w:tc>
-        <w:tc>
-          <w:tcPr>
-            <w:tcW w:w="3120" w:type="dxa"/>
-          </w:tcPr>
-          <w:p>
-            <w:r>
-              <w:t xml:space="preserve">if a load line floats when off</w:t>
-            </w:r>
-          </w:p>
-        </w:tc>
-      </w:tr>
-      <w:tr>
-        <w:tc>
-          <w:tcPr>
-            <w:tcW w:w="3120" w:type="dxa"/>
+            <w:tcW w:w="1560" w:type="dxa"/>
+          </w:tcPr>
+          <w:p>
+            <w:r>
+              <w:t xml:space="preserve">DNP 0R</w:t>
+            </w:r>
+          </w:p>
+        </w:tc>
+        <w:tc>
+          <w:tcPr>
+            <w:tcW w:w="1560" w:type="dxa"/>
+          </w:tcPr>
+          <w:p>
+            <w:r>
+              <w:t xml:space="preserve">DLC6_D29 / K_LINE</w:t>
+            </w:r>
+          </w:p>
+        </w:tc>
+        <w:tc>
+          <w:tcPr>
+            <w:tcW w:w="1560" w:type="dxa"/>
+          </w:tcPr>
+          <w:p>
+            <w:r>
+              <w:t xml:space="preserve">not fitted</w:t>
+            </w:r>
+          </w:p>
+        </w:tc>
+        <w:tc>
+          <w:tcPr>
+            <w:tcW w:w="1560" w:type="dxa"/>
+          </w:tcPr>
+          <w:p>
+            <w:r>
+              <w:t xml:space="preserve">D29 turns out to be a second K-line</w:t>
+            </w:r>
+          </w:p>
+        </w:tc>
+      </w:tr>
+      <w:tr>
+        <w:tc>
+          <w:tcPr>
+            <w:tcW w:w="1560" w:type="dxa"/>
+          </w:tcPr>
+          <w:p>
+            <w:r>
+              <w:t xml:space="preserve">Comms</w:t>
+            </w:r>
+          </w:p>
+        </w:tc>
+        <w:tc>
+          <w:tcPr>
+            <w:tcW w:w="1560" w:type="dxa"/>
+          </w:tcPr>
+          <w:p>
+            <w:r>
+              <w:t xml:space="preserve">R54</w:t>
+            </w:r>
+          </w:p>
+        </w:tc>
+        <w:tc>
+          <w:tcPr>
+            <w:tcW w:w="1560" w:type="dxa"/>
+          </w:tcPr>
+          <w:p>
+            <w:r>
+              <w:t xml:space="preserve">120</w:t>
+            </w:r>
+          </w:p>
+        </w:tc>
+        <w:tc>
+          <w:tcPr>
+            <w:tcW w:w="1560" w:type="dxa"/>
+          </w:tcPr>
+          <w:p>
+            <w:r>
+              <w:t xml:space="preserve">CAN_H / CAN_L</w:t>
+            </w:r>
+          </w:p>
+        </w:tc>
+        <w:tc>
+          <w:tcPr>
+            <w:tcW w:w="1560" w:type="dxa"/>
+          </w:tcPr>
+          <w:p>
+            <w:r>
+              <w:t xml:space="preserve">not fitted</w:t>
+            </w:r>
+          </w:p>
+        </w:tc>
+        <w:tc>
+          <w:tcPr>
+            <w:tcW w:w="1560" w:type="dxa"/>
+          </w:tcPr>
+          <w:p>
+            <w:r>
+              <w:t xml:space="preserve">external CAN device that does not terminate the bus</w:t>
+            </w:r>
+          </w:p>
+        </w:tc>
+      </w:tr>
+      <w:tr>
+        <w:tc>
+          <w:tcPr>
+            <w:tcW w:w="1560" w:type="dxa"/>
+          </w:tcPr>
+          <w:p>
+            <w:r>
+              <w:t xml:space="preserve">Inputs</w:t>
+            </w:r>
+          </w:p>
+        </w:tc>
+        <w:tc>
+          <w:tcPr>
+            <w:tcW w:w="1560" w:type="dxa"/>
+          </w:tcPr>
+          <w:p>
+            <w:r>
+              <w:t xml:space="preserve">R44</w:t>
+            </w:r>
+          </w:p>
+        </w:tc>
+        <w:tc>
+          <w:tcPr>
+            <w:tcW w:w="1560" w:type="dxa"/>
+          </w:tcPr>
+          <w:p>
+            <w:r>
+              <w:t xml:space="preserve">4.7k</w:t>
+            </w:r>
+          </w:p>
+        </w:tc>
+        <w:tc>
+          <w:tcPr>
+            <w:tcW w:w="1560" w:type="dxa"/>
+          </w:tcPr>
+          <w:p>
+            <w:r>
+              <w:t xml:space="preserve">GND / IN_NEUTRAL_SWITCH</w:t>
+            </w:r>
+          </w:p>
+        </w:tc>
+        <w:tc>
+          <w:tcPr>
+            <w:tcW w:w="1560" w:type="dxa"/>
+          </w:tcPr>
+          <w:p>
+            <w:r>
+              <w:t xml:space="preserve">not fitted</w:t>
+            </w:r>
+          </w:p>
+        </w:tc>
+        <w:tc>
+          <w:tcPr>
+            <w:tcW w:w="1560" w:type="dxa"/>
+          </w:tcPr>
+          <w:p>
+            <w:r>
+              <w:t xml:space="preserve">neutral switch turns out to be 12 V-active</w:t>
+            </w:r>
+          </w:p>
+        </w:tc>
+      </w:tr>
+      <w:tr>
+        <w:tc>
+          <w:tcPr>
+            <w:tcW w:w="1560" w:type="dxa"/>
+          </w:tcPr>
+          <w:p>
+            <w:r>
+              <w:t xml:space="preserve">Inputs</w:t>
+            </w:r>
+          </w:p>
+        </w:tc>
+        <w:tc>
+          <w:tcPr>
+            <w:tcW w:w="1560" w:type="dxa"/>
+          </w:tcPr>
+          <w:p>
+            <w:r>
+              <w:t xml:space="preserve">R45</w:t>
+            </w:r>
+          </w:p>
+        </w:tc>
+        <w:tc>
+          <w:tcPr>
+            <w:tcW w:w="1560" w:type="dxa"/>
+          </w:tcPr>
+          <w:p>
+            <w:r>
+              <w:t xml:space="preserve">1k</w:t>
+            </w:r>
+          </w:p>
+        </w:tc>
+        <w:tc>
+          <w:tcPr>
+            <w:tcW w:w="1560" w:type="dxa"/>
+          </w:tcPr>
+          <w:p>
+            <w:r>
+              <w:t xml:space="preserve">+5VA / IN_FUEL_LEVEL</w:t>
+            </w:r>
+          </w:p>
+        </w:tc>
+        <w:tc>
+          <w:tcPr>
+            <w:tcW w:w="1560" w:type="dxa"/>
+          </w:tcPr>
+          <w:p>
+            <w:r>
+              <w:t xml:space="preserve">not fitted</w:t>
+            </w:r>
+          </w:p>
+        </w:tc>
+        <w:tc>
+          <w:tcPr>
+            <w:tcW w:w="1560" w:type="dxa"/>
+          </w:tcPr>
+          <w:p>
+            <w:r>
+              <w:t xml:space="preserve">tune the fuel gauge reading</w:t>
+            </w:r>
+          </w:p>
+        </w:tc>
+      </w:tr>
+      <w:tr>
+        <w:tc>
+          <w:tcPr>
+            <w:tcW w:w="1560" w:type="dxa"/>
+          </w:tcPr>
+          <w:p>
+            <w:r>
+              <w:t xml:space="preserve">Inputs</w:t>
+            </w:r>
+          </w:p>
+        </w:tc>
+        <w:tc>
+          <w:tcPr>
+            <w:tcW w:w="1560" w:type="dxa"/>
+          </w:tcPr>
+          <w:p>
+            <w:r>
+              <w:t xml:space="preserve">R51</w:t>
+            </w:r>
+          </w:p>
+        </w:tc>
+        <w:tc>
+          <w:tcPr>
+            <w:tcW w:w="1560" w:type="dxa"/>
+          </w:tcPr>
+          <w:p>
+            <w:r>
+              <w:t xml:space="preserve">10k</w:t>
+            </w:r>
+          </w:p>
+        </w:tc>
+        <w:tc>
+          <w:tcPr>
+            <w:tcW w:w="1560" w:type="dxa"/>
+          </w:tcPr>
+          <w:p>
+            <w:r>
+              <w:t xml:space="preserve">+5V / IN_DEFOG</w:t>
+            </w:r>
+          </w:p>
+        </w:tc>
+        <w:tc>
+          <w:tcPr>
+            <w:tcW w:w="1560" w:type="dxa"/>
+          </w:tcPr>
+          <w:p>
+            <w:r>
+              <w:t xml:space="preserve">not fitted</w:t>
+            </w:r>
+          </w:p>
+        </w:tc>
+        <w:tc>
+          <w:tcPr>
+            <w:tcW w:w="1560" w:type="dxa"/>
+          </w:tcPr>
+          <w:p>
+            <w:r>
+              <w:t xml:space="preserve">defogger line floats when off: stronger pull-up</w:t>
+            </w:r>
+          </w:p>
+        </w:tc>
+      </w:tr>
+      <w:tr>
+        <w:tc>
+          <w:tcPr>
+            <w:tcW w:w="1560" w:type="dxa"/>
+          </w:tcPr>
+          <w:p>
+            <w:r>
+              <w:t xml:space="preserve">Inputs</w:t>
+            </w:r>
+          </w:p>
+        </w:tc>
+        <w:tc>
+          <w:tcPr>
+            <w:tcW w:w="1560" w:type="dxa"/>
+          </w:tcPr>
+          <w:p>
+            <w:r>
+              <w:t xml:space="preserve">R52</w:t>
+            </w:r>
+          </w:p>
+        </w:tc>
+        <w:tc>
+          <w:tcPr>
+            <w:tcW w:w="1560" w:type="dxa"/>
+          </w:tcPr>
+          <w:p>
+            <w:r>
+              <w:t xml:space="preserve">10k</w:t>
+            </w:r>
+          </w:p>
+        </w:tc>
+        <w:tc>
+          <w:tcPr>
+            <w:tcW w:w="1560" w:type="dxa"/>
+          </w:tcPr>
+          <w:p>
+            <w:r>
+              <w:t xml:space="preserve">+5V / IN_SMALL_LIGHT</w:t>
+            </w:r>
+          </w:p>
+        </w:tc>
+        <w:tc>
+          <w:tcPr>
+            <w:tcW w:w="1560" w:type="dxa"/>
+          </w:tcPr>
+          <w:p>
+            <w:r>
+              <w:t xml:space="preserve">not fitted</w:t>
+            </w:r>
+          </w:p>
+        </w:tc>
+        <w:tc>
+          <w:tcPr>
+            <w:tcW w:w="1560" w:type="dxa"/>
+          </w:tcPr>
+          <w:p>
+            <w:r>
+              <w:t xml:space="preserve">lights line floats when off: stronger pull-up</w:t>
+            </w:r>
+          </w:p>
+        </w:tc>
+      </w:tr>
+      <w:tr>
+        <w:tc>
+          <w:tcPr>
+            <w:tcW w:w="1560" w:type="dxa"/>
+          </w:tcPr>
+          <w:p>
+            <w:r>
+              <w:t xml:space="preserve">Inputs</w:t>
+            </w:r>
+          </w:p>
+        </w:tc>
+        <w:tc>
+          <w:tcPr>
+            <w:tcW w:w="1560" w:type="dxa"/>
+          </w:tcPr>
+          <w:p>
+            <w:r>
+              <w:t xml:space="preserve">R53</w:t>
+            </w:r>
+          </w:p>
+        </w:tc>
+        <w:tc>
+          <w:tcPr>
+            <w:tcW w:w="1560" w:type="dxa"/>
+          </w:tcPr>
+          <w:p>
+            <w:r>
+              <w:t xml:space="preserve">10k</w:t>
+            </w:r>
+          </w:p>
+        </w:tc>
+        <w:tc>
+          <w:tcPr>
+            <w:tcW w:w="1560" w:type="dxa"/>
+          </w:tcPr>
+          <w:p>
+            <w:r>
+              <w:t xml:space="preserve">+5V / IN_BLOWER</w:t>
+            </w:r>
+          </w:p>
+        </w:tc>
+        <w:tc>
+          <w:tcPr>
+            <w:tcW w:w="1560" w:type="dxa"/>
+          </w:tcPr>
+          <w:p>
+            <w:r>
+              <w:t xml:space="preserve">not fitted</w:t>
+            </w:r>
+          </w:p>
+        </w:tc>
+        <w:tc>
+          <w:tcPr>
+            <w:tcW w:w="1560" w:type="dxa"/>
+          </w:tcPr>
+          <w:p>
+            <w:r>
+              <w:t xml:space="preserve">blower line floats when off: stronger pull-up</w:t>
+            </w:r>
+          </w:p>
+        </w:tc>
+      </w:tr>
+      <w:tr>
+        <w:tc>
+          <w:tcPr>
+            <w:tcW w:w="1560" w:type="dxa"/>
+          </w:tcPr>
+          <w:p>
+            <w:r>
+              <w:t xml:space="preserve">Mcu</w:t>
+            </w:r>
+          </w:p>
+        </w:tc>
+        <w:tc>
+          <w:tcPr>
+            <w:tcW w:w="1560" w:type="dxa"/>
           </w:tcPr>
           <w:p>
             <w:r>
@@ -2772,29 +3660,59 @@
         </w:tc>
         <w:tc>
           <w:tcPr>
-            <w:tcW w:w="3120" w:type="dxa"/>
-          </w:tcPr>
-          <w:p>
-            <w:r>
-              <w:t xml:space="preserve">BOOT0 to 3.3 V</w:t>
-            </w:r>
-          </w:p>
-        </w:tc>
-        <w:tc>
-          <w:tcPr>
-            <w:tcW w:w="3120" w:type="dxa"/>
-          </w:tcPr>
-          <w:p>
-            <w:r>
-              <w:t xml:space="preserve">bridge to force USB DFU bootloader</w:t>
-            </w:r>
-          </w:p>
-        </w:tc>
-      </w:tr>
-      <w:tr>
-        <w:tc>
-          <w:tcPr>
-            <w:tcW w:w="3120" w:type="dxa"/>
+            <w:tcW w:w="1560" w:type="dxa"/>
+          </w:tcPr>
+          <w:p>
+            <w:r>
+              <w:t xml:space="preserve">0R</w:t>
+            </w:r>
+          </w:p>
+        </w:tc>
+        <w:tc>
+          <w:tcPr>
+            <w:tcW w:w="1560" w:type="dxa"/>
+          </w:tcPr>
+          <w:p>
+            <w:r>
+              <w:t xml:space="preserve">GND / USB_SHIELD</w:t>
+            </w:r>
+          </w:p>
+        </w:tc>
+        <w:tc>
+          <w:tcPr>
+            <w:tcW w:w="1560" w:type="dxa"/>
+          </w:tcPr>
+          <w:p>
+            <w:r>
+              <w:t xml:space="preserve">fitted</w:t>
+            </w:r>
+          </w:p>
+        </w:tc>
+        <w:tc>
+          <w:tcPr>
+            <w:tcW w:w="1560" w:type="dxa"/>
+          </w:tcPr>
+          <w:p>
+            <w:r>
+              <w:t xml:space="preserve">FITTED: USB shell to GND (remove to float the shell)</w:t>
+            </w:r>
+          </w:p>
+        </w:tc>
+      </w:tr>
+      <w:tr>
+        <w:tc>
+          <w:tcPr>
+            <w:tcW w:w="1560" w:type="dxa"/>
+          </w:tcPr>
+          <w:p>
+            <w:r>
+              <w:t xml:space="preserve">Mcu</w:t>
+            </w:r>
+          </w:p>
+        </w:tc>
+        <w:tc>
+          <w:tcPr>
+            <w:tcW w:w="1560" w:type="dxa"/>
           </w:tcPr>
           <w:p>
             <w:r>
@@ -2804,53 +3722,723 @@
         </w:tc>
         <w:tc>
           <w:tcPr>
-            <w:tcW w:w="3120" w:type="dxa"/>
-          </w:tcPr>
-          <w:p>
-            <w:r>
-              <w:t xml:space="preserve">Pedal 5 V back onto +5VAS</w:t>
-            </w:r>
-          </w:p>
-        </w:tc>
-        <w:tc>
-          <w:tcPr>
-            <w:tcW w:w="3120" w:type="dxa"/>
-          </w:tcPr>
-          <w:p>
-            <w:r>
-              <w:t xml:space="preserve">only if M8 is not fitted</w:t>
-            </w:r>
-          </w:p>
-        </w:tc>
-      </w:tr>
-      <w:tr>
-        <w:tc>
-          <w:tcPr>
-            <w:tcW w:w="3120" w:type="dxa"/>
-          </w:tcPr>
-          <w:p>
-            <w:r>
-              <w:t xml:space="preserve">R52 120R</w:t>
-            </w:r>
-          </w:p>
-        </w:tc>
-        <w:tc>
-          <w:tcPr>
-            <w:tcW w:w="3120" w:type="dxa"/>
-          </w:tcPr>
-          <w:p>
-            <w:r>
-              <w:t xml:space="preserve">CAN terminator at the aux connector</w:t>
-            </w:r>
-          </w:p>
-        </w:tc>
-        <w:tc>
-          <w:tcPr>
-            <w:tcW w:w="3120" w:type="dxa"/>
-          </w:tcPr>
-          <w:p>
-            <w:r>
-              <w:t xml:space="preserve">external CAN device that does not terminate</w:t>
+            <w:tcW w:w="1560" w:type="dxa"/>
+          </w:tcPr>
+          <w:p>
+            <w:r>
+              <w:t xml:space="preserve">DNP 0R</w:t>
+            </w:r>
+          </w:p>
+        </w:tc>
+        <w:tc>
+          <w:tcPr>
+            <w:tcW w:w="1560" w:type="dxa"/>
+          </w:tcPr>
+          <w:p>
+            <w:r>
+              <w:t xml:space="preserve">+3.3V / BOOT0</w:t>
+            </w:r>
+          </w:p>
+        </w:tc>
+        <w:tc>
+          <w:tcPr>
+            <w:tcW w:w="1560" w:type="dxa"/>
+          </w:tcPr>
+          <w:p>
+            <w:r>
+              <w:t xml:space="preserve">not fitted</w:t>
+            </w:r>
+          </w:p>
+        </w:tc>
+        <w:tc>
+          <w:tcPr>
+            <w:tcW w:w="1560" w:type="dxa"/>
+          </w:tcPr>
+          <w:p>
+            <w:r>
+              <w:t xml:space="preserve">bridge to force the USB DFU bootloader</w:t>
+            </w:r>
+          </w:p>
+        </w:tc>
+      </w:tr>
+      <w:tr>
+        <w:tc>
+          <w:tcPr>
+            <w:tcW w:w="1560" w:type="dxa"/>
+          </w:tcPr>
+          <w:p>
+            <w:r>
+              <w:t xml:space="preserve">Outputs</w:t>
+            </w:r>
+          </w:p>
+        </w:tc>
+        <w:tc>
+          <w:tcPr>
+            <w:tcW w:w="1560" w:type="dxa"/>
+          </w:tcPr>
+          <w:p>
+            <w:r>
+              <w:t xml:space="preserve">JP5</w:t>
+            </w:r>
+          </w:p>
+        </w:tc>
+        <w:tc>
+          <w:tcPr>
+            <w:tcW w:w="1560" w:type="dxa"/>
+          </w:tcPr>
+          <w:p>
+            <w:r>
+              <w:t xml:space="preserve">DNP 0R</w:t>
+            </w:r>
+          </w:p>
+        </w:tc>
+        <w:tc>
+          <w:tcPr>
+            <w:tcW w:w="1560" w:type="dxa"/>
+          </w:tcPr>
+          <w:p>
+            <w:r>
+              <w:t xml:space="preserve">EVAP_A12 / OUT_SPARE_LS1</w:t>
+            </w:r>
+          </w:p>
+        </w:tc>
+        <w:tc>
+          <w:tcPr>
+            <w:tcW w:w="1560" w:type="dxa"/>
+          </w:tcPr>
+          <w:p>
+            <w:r>
+              <w:t xml:space="preserve">not fitted</w:t>
+            </w:r>
+          </w:p>
+        </w:tc>
+        <w:tc>
+          <w:tcPr>
+            <w:tcW w:w="1560" w:type="dxa"/>
+          </w:tcPr>
+          <w:p>
+            <w:r>
+              <w:t xml:space="preserve">drive EVAP A12 from spare low-side 1</w:t>
+            </w:r>
+          </w:p>
+        </w:tc>
+      </w:tr>
+      <w:tr>
+        <w:tc>
+          <w:tcPr>
+            <w:tcW w:w="1560" w:type="dxa"/>
+          </w:tcPr>
+          <w:p>
+            <w:r>
+              <w:t xml:space="preserve">Outputs</w:t>
+            </w:r>
+          </w:p>
+        </w:tc>
+        <w:tc>
+          <w:tcPr>
+            <w:tcW w:w="1560" w:type="dxa"/>
+          </w:tcPr>
+          <w:p>
+            <w:r>
+              <w:t xml:space="preserve">JP6</w:t>
+            </w:r>
+          </w:p>
+        </w:tc>
+        <w:tc>
+          <w:tcPr>
+            <w:tcW w:w="1560" w:type="dxa"/>
+          </w:tcPr>
+          <w:p>
+            <w:r>
+              <w:t xml:space="preserve">DNP 0R</w:t>
+            </w:r>
+          </w:p>
+        </w:tc>
+        <w:tc>
+          <w:tcPr>
+            <w:tcW w:w="1560" w:type="dxa"/>
+          </w:tcPr>
+          <w:p>
+            <w:r>
+              <w:t xml:space="preserve">EVAP_A13 / OUT_SPARE_LS2</w:t>
+            </w:r>
+          </w:p>
+        </w:tc>
+        <w:tc>
+          <w:tcPr>
+            <w:tcW w:w="1560" w:type="dxa"/>
+          </w:tcPr>
+          <w:p>
+            <w:r>
+              <w:t xml:space="preserve">not fitted</w:t>
+            </w:r>
+          </w:p>
+        </w:tc>
+        <w:tc>
+          <w:tcPr>
+            <w:tcW w:w="1560" w:type="dxa"/>
+          </w:tcPr>
+          <w:p>
+            <w:r>
+              <w:t xml:space="preserve">drive EVAP A13 from spare low-side 2</w:t>
+            </w:r>
+          </w:p>
+        </w:tc>
+      </w:tr>
+      <w:tr>
+        <w:tc>
+          <w:tcPr>
+            <w:tcW w:w="1560" w:type="dxa"/>
+          </w:tcPr>
+          <w:p>
+            <w:r>
+              <w:t xml:space="preserve">Outputs</w:t>
+            </w:r>
+          </w:p>
+        </w:tc>
+        <w:tc>
+          <w:tcPr>
+            <w:tcW w:w="1560" w:type="dxa"/>
+          </w:tcPr>
+          <w:p>
+            <w:r>
+              <w:t xml:space="preserve">R38</w:t>
+            </w:r>
+          </w:p>
+        </w:tc>
+        <w:tc>
+          <w:tcPr>
+            <w:tcW w:w="1560" w:type="dxa"/>
+          </w:tcPr>
+          <w:p>
+            <w:r>
+              <w:t xml:space="preserve">2.2k</w:t>
+            </w:r>
+          </w:p>
+        </w:tc>
+        <w:tc>
+          <w:tcPr>
+            <w:tcW w:w="1560" w:type="dxa"/>
+          </w:tcPr>
+          <w:p>
+            <w:r>
+              <w:t xml:space="preserve">+12V_RAW / OUT_TACH</w:t>
+            </w:r>
+          </w:p>
+        </w:tc>
+        <w:tc>
+          <w:tcPr>
+            <w:tcW w:w="1560" w:type="dxa"/>
+          </w:tcPr>
+          <w:p>
+            <w:r>
+              <w:t xml:space="preserve">not fitted</w:t>
+            </w:r>
+          </w:p>
+        </w:tc>
+        <w:tc>
+          <w:tcPr>
+            <w:tcW w:w="1560" w:type="dxa"/>
+          </w:tcPr>
+          <w:p>
+            <w:r>
+              <w:t xml:space="preserve">tach needle dead: pull-up to 12 V</w:t>
+            </w:r>
+          </w:p>
+        </w:tc>
+      </w:tr>
+      <w:tr>
+        <w:tc>
+          <w:tcPr>
+            <w:tcW w:w="1560" w:type="dxa"/>
+          </w:tcPr>
+          <w:p>
+            <w:r>
+              <w:t xml:space="preserve">Outputs</w:t>
+            </w:r>
+          </w:p>
+        </w:tc>
+        <w:tc>
+          <w:tcPr>
+            <w:tcW w:w="1560" w:type="dxa"/>
+          </w:tcPr>
+          <w:p>
+            <w:r>
+              <w:t xml:space="preserve">R39</w:t>
+            </w:r>
+          </w:p>
+        </w:tc>
+        <w:tc>
+          <w:tcPr>
+            <w:tcW w:w="1560" w:type="dxa"/>
+          </w:tcPr>
+          <w:p>
+            <w:r>
+              <w:t xml:space="preserve">100</w:t>
+            </w:r>
+          </w:p>
+        </w:tc>
+        <w:tc>
+          <w:tcPr>
+            <w:tcW w:w="1560" w:type="dxa"/>
+          </w:tcPr>
+          <w:p>
+            <w:r>
+              <w:t xml:space="preserve">FP_CMD / FUEL_PUMP_SIGNAL1</w:t>
+            </w:r>
+          </w:p>
+        </w:tc>
+        <w:tc>
+          <w:tcPr>
+            <w:tcW w:w="1560" w:type="dxa"/>
+          </w:tcPr>
+          <w:p>
+            <w:r>
+              <w:t xml:space="preserve">fitted</w:t>
+            </w:r>
+          </w:p>
+        </w:tc>
+        <w:tc>
+          <w:tcPr>
+            <w:tcW w:w="1560" w:type="dxa"/>
+          </w:tcPr>
+          <w:p>
+            <w:r>
+              <w:t xml:space="preserve">FITTED: series protection on the FPCU command</w:t>
+            </w:r>
+          </w:p>
+        </w:tc>
+      </w:tr>
+      <w:tr>
+        <w:tc>
+          <w:tcPr>
+            <w:tcW w:w="1560" w:type="dxa"/>
+          </w:tcPr>
+          <w:p>
+            <w:r>
+              <w:t xml:space="preserve">Outputs</w:t>
+            </w:r>
+          </w:p>
+        </w:tc>
+        <w:tc>
+          <w:tcPr>
+            <w:tcW w:w="1560" w:type="dxa"/>
+          </w:tcPr>
+          <w:p>
+            <w:r>
+              <w:t xml:space="preserve">R40</w:t>
+            </w:r>
+          </w:p>
+        </w:tc>
+        <w:tc>
+          <w:tcPr>
+            <w:tcW w:w="1560" w:type="dxa"/>
+          </w:tcPr>
+          <w:p>
+            <w:r>
+              <w:t xml:space="preserve">1k</w:t>
+            </w:r>
+          </w:p>
+        </w:tc>
+        <w:tc>
+          <w:tcPr>
+            <w:tcW w:w="1560" w:type="dxa"/>
+          </w:tcPr>
+          <w:p>
+            <w:r>
+              <w:t xml:space="preserve">+5V / FUEL_PUMP_SIGNAL1</w:t>
+            </w:r>
+          </w:p>
+        </w:tc>
+        <w:tc>
+          <w:tcPr>
+            <w:tcW w:w="1560" w:type="dxa"/>
+          </w:tcPr>
+          <w:p>
+            <w:r>
+              <w:t xml:space="preserve">not fitted</w:t>
+            </w:r>
+          </w:p>
+        </w:tc>
+        <w:tc>
+          <w:tcPr>
+            <w:tcW w:w="1560" w:type="dxa"/>
+          </w:tcPr>
+          <w:p>
+            <w:r>
+              <w:t xml:space="preserve">FPCU input needs a pull-up (scope the stock ECM first)</w:t>
+            </w:r>
+          </w:p>
+        </w:tc>
+      </w:tr>
+      <w:tr>
+        <w:tc>
+          <w:tcPr>
+            <w:tcW w:w="1560" w:type="dxa"/>
+          </w:tcPr>
+          <w:p>
+            <w:r>
+              <w:t xml:space="preserve">Outputs</w:t>
+            </w:r>
+          </w:p>
+        </w:tc>
+        <w:tc>
+          <w:tcPr>
+            <w:tcW w:w="1560" w:type="dxa"/>
+          </w:tcPr>
+          <w:p>
+            <w:r>
+              <w:t xml:space="preserve">R41</w:t>
+            </w:r>
+          </w:p>
+        </w:tc>
+        <w:tc>
+          <w:tcPr>
+            <w:tcW w:w="1560" w:type="dxa"/>
+          </w:tcPr>
+          <w:p>
+            <w:r>
+              <w:t xml:space="preserve">10k</w:t>
+            </w:r>
+          </w:p>
+        </w:tc>
+        <w:tc>
+          <w:tcPr>
+            <w:tcW w:w="1560" w:type="dxa"/>
+          </w:tcPr>
+          <w:p>
+            <w:r>
+              <w:t xml:space="preserve">FUEL_PUMP_SIGNAL1 / GND</w:t>
+            </w:r>
+          </w:p>
+        </w:tc>
+        <w:tc>
+          <w:tcPr>
+            <w:tcW w:w="1560" w:type="dxa"/>
+          </w:tcPr>
+          <w:p>
+            <w:r>
+              <w:t xml:space="preserve">not fitted</w:t>
+            </w:r>
+          </w:p>
+        </w:tc>
+        <w:tc>
+          <w:tcPr>
+            <w:tcW w:w="1560" w:type="dxa"/>
+          </w:tcPr>
+          <w:p>
+            <w:r>
+              <w:t xml:space="preserve">FPCU input needs a pull-down</w:t>
+            </w:r>
+          </w:p>
+        </w:tc>
+      </w:tr>
+      <w:tr>
+        <w:tc>
+          <w:tcPr>
+            <w:tcW w:w="1560" w:type="dxa"/>
+          </w:tcPr>
+          <w:p>
+            <w:r>
+              <w:t xml:space="preserve">Power</w:t>
+            </w:r>
+          </w:p>
+        </w:tc>
+        <w:tc>
+          <w:tcPr>
+            <w:tcW w:w="1560" w:type="dxa"/>
+          </w:tcPr>
+          <w:p>
+            <w:r>
+              <w:t xml:space="preserve">JP12</w:t>
+            </w:r>
+          </w:p>
+        </w:tc>
+        <w:tc>
+          <w:tcPr>
+            <w:tcW w:w="1560" w:type="dxa"/>
+          </w:tcPr>
+          <w:p>
+            <w:r>
+              <w:t xml:space="preserve">DNP 0R</w:t>
+            </w:r>
+          </w:p>
+        </w:tc>
+        <w:tc>
+          <w:tcPr>
+            <w:tcW w:w="1560" w:type="dxa"/>
+          </w:tcPr>
+          <w:p>
+            <w:r>
+              <w:t xml:space="preserve">+5VAS / APS_PS_5V</w:t>
+            </w:r>
+          </w:p>
+        </w:tc>
+        <w:tc>
+          <w:tcPr>
+            <w:tcW w:w="1560" w:type="dxa"/>
+          </w:tcPr>
+          <w:p>
+            <w:r>
+              <w:t xml:space="preserve">not fitted</w:t>
+            </w:r>
+          </w:p>
+        </w:tc>
+        <w:tc>
+          <w:tcPr>
+            <w:tcW w:w="1560" w:type="dxa"/>
+          </w:tcPr>
+          <w:p>
+            <w:r>
+              <w:t xml:space="preserve">only if M8 is not fitted: pedal back on the shared sensor 5 V</w:t>
+            </w:r>
+          </w:p>
+        </w:tc>
+      </w:tr>
+      <w:tr>
+        <w:tc>
+          <w:tcPr>
+            <w:tcW w:w="1560" w:type="dxa"/>
+          </w:tcPr>
+          <w:p>
+            <w:r>
+              <w:t xml:space="preserve">Sensors</w:t>
+            </w:r>
+          </w:p>
+        </w:tc>
+        <w:tc>
+          <w:tcPr>
+            <w:tcW w:w="1560" w:type="dxa"/>
+          </w:tcPr>
+          <w:p>
+            <w:r>
+              <w:t xml:space="preserve">JP8</w:t>
+            </w:r>
+          </w:p>
+        </w:tc>
+        <w:tc>
+          <w:tcPr>
+            <w:tcW w:w="1560" w:type="dxa"/>
+          </w:tcPr>
+          <w:p>
+            <w:r>
+              <w:t xml:space="preserve">0R</w:t>
+            </w:r>
+          </w:p>
+        </w:tc>
+        <w:tc>
+          <w:tcPr>
+            <w:tcW w:w="1560" w:type="dxa"/>
+          </w:tcPr>
+          <w:p>
+            <w:r>
+              <w:t xml:space="preserve">GND / GND_SENSOR</w:t>
+            </w:r>
+          </w:p>
+        </w:tc>
+        <w:tc>
+          <w:tcPr>
+            <w:tcW w:w="1560" w:type="dxa"/>
+          </w:tcPr>
+          <w:p>
+            <w:r>
+              <w:t xml:space="preserve">fitted</w:t>
+            </w:r>
+          </w:p>
+        </w:tc>
+        <w:tc>
+          <w:tcPr>
+            <w:tcW w:w="1560" w:type="dxa"/>
+          </w:tcPr>
+          <w:p>
+            <w:r>
+              <w:t xml:space="preserve">FITTED: sensor returns to GND (remove to move them to GNDA)</w:t>
+            </w:r>
+          </w:p>
+        </w:tc>
+      </w:tr>
+      <w:tr>
+        <w:tc>
+          <w:tcPr>
+            <w:tcW w:w="1560" w:type="dxa"/>
+          </w:tcPr>
+          <w:p>
+            <w:r>
+              <w:t xml:space="preserve">Sensors</w:t>
+            </w:r>
+          </w:p>
+        </w:tc>
+        <w:tc>
+          <w:tcPr>
+            <w:tcW w:w="1560" w:type="dxa"/>
+          </w:tcPr>
+          <w:p>
+            <w:r>
+              <w:t xml:space="preserve">JP9</w:t>
+            </w:r>
+          </w:p>
+        </w:tc>
+        <w:tc>
+          <w:tcPr>
+            <w:tcW w:w="1560" w:type="dxa"/>
+          </w:tcPr>
+          <w:p>
+            <w:r>
+              <w:t xml:space="preserve">DNP 0R</w:t>
+            </w:r>
+          </w:p>
+        </w:tc>
+        <w:tc>
+          <w:tcPr>
+            <w:tcW w:w="1560" w:type="dxa"/>
+          </w:tcPr>
+          <w:p>
+            <w:r>
+              <w:t xml:space="preserve">GNDA / GND_SENSOR</w:t>
+            </w:r>
+          </w:p>
+        </w:tc>
+        <w:tc>
+          <w:tcPr>
+            <w:tcW w:w="1560" w:type="dxa"/>
+          </w:tcPr>
+          <w:p>
+            <w:r>
+              <w:t xml:space="preserve">not fitted</w:t>
+            </w:r>
+          </w:p>
+        </w:tc>
+        <w:tc>
+          <w:tcPr>
+            <w:tcW w:w="1560" w:type="dxa"/>
+          </w:tcPr>
+          <w:p>
+            <w:r>
+              <w:t xml:space="preserve">sensor returns on analog ground instead of GND</w:t>
+            </w:r>
+          </w:p>
+        </w:tc>
+      </w:tr>
+      <w:tr>
+        <w:tc>
+          <w:tcPr>
+            <w:tcW w:w="1560" w:type="dxa"/>
+          </w:tcPr>
+          <w:p>
+            <w:r>
+              <w:t xml:space="preserve">Sensors</w:t>
+            </w:r>
+          </w:p>
+        </w:tc>
+        <w:tc>
+          <w:tcPr>
+            <w:tcW w:w="1560" w:type="dxa"/>
+          </w:tcPr>
+          <w:p>
+            <w:r>
+              <w:t xml:space="preserve">R42</w:t>
+            </w:r>
+          </w:p>
+        </w:tc>
+        <w:tc>
+          <w:tcPr>
+            <w:tcW w:w="1560" w:type="dxa"/>
+          </w:tcPr>
+          <w:p>
+            <w:r>
+              <w:t xml:space="preserve">1k</w:t>
+            </w:r>
+          </w:p>
+        </w:tc>
+        <w:tc>
+          <w:tcPr>
+            <w:tcW w:w="1560" w:type="dxa"/>
+          </w:tcPr>
+          <w:p>
+            <w:r>
+              <w:t xml:space="preserve">+5VA / IN_CAM</w:t>
+            </w:r>
+          </w:p>
+        </w:tc>
+        <w:tc>
+          <w:tcPr>
+            <w:tcW w:w="1560" w:type="dxa"/>
+          </w:tcPr>
+          <w:p>
+            <w:r>
+              <w:t xml:space="preserve">not fitted</w:t>
+            </w:r>
+          </w:p>
+        </w:tc>
+        <w:tc>
+          <w:tcPr>
+            <w:tcW w:w="1560" w:type="dxa"/>
+          </w:tcPr>
+          <w:p>
+            <w:r>
+              <w:t xml:space="preserve">stronger pull-up, LH cam (weak or noisy signal)</w:t>
+            </w:r>
+          </w:p>
+        </w:tc>
+      </w:tr>
+      <w:tr>
+        <w:tc>
+          <w:tcPr>
+            <w:tcW w:w="1560" w:type="dxa"/>
+          </w:tcPr>
+          <w:p>
+            <w:r>
+              <w:t xml:space="preserve">Sensors</w:t>
+            </w:r>
+          </w:p>
+        </w:tc>
+        <w:tc>
+          <w:tcPr>
+            <w:tcW w:w="1560" w:type="dxa"/>
+          </w:tcPr>
+          <w:p>
+            <w:r>
+              <w:t xml:space="preserve">R43</w:t>
+            </w:r>
+          </w:p>
+        </w:tc>
+        <w:tc>
+          <w:tcPr>
+            <w:tcW w:w="1560" w:type="dxa"/>
+          </w:tcPr>
+          <w:p>
+            <w:r>
+              <w:t xml:space="preserve">1k</w:t>
+            </w:r>
+          </w:p>
+        </w:tc>
+        <w:tc>
+          <w:tcPr>
+            <w:tcW w:w="1560" w:type="dxa"/>
+          </w:tcPr>
+          <w:p>
+            <w:r>
+              <w:t xml:space="preserve">+5VA / IN_CAM_RH</w:t>
+            </w:r>
+          </w:p>
+        </w:tc>
+        <w:tc>
+          <w:tcPr>
+            <w:tcW w:w="1560" w:type="dxa"/>
+          </w:tcPr>
+          <w:p>
+            <w:r>
+              <w:t xml:space="preserve">not fitted</w:t>
+            </w:r>
+          </w:p>
+        </w:tc>
+        <w:tc>
+          <w:tcPr>
+            <w:tcW w:w="1560" w:type="dxa"/>
+          </w:tcPr>
+          <w:p>
+            <w:r>
+              <w:t xml:space="preserve">stronger pull-up, RH cam</w:t>
             </w:r>
           </w:p>
         </w:tc>
@@ -2858,7 +4446,7 @@
     </w:tbl>
     <w:p>
       <w:r>
-        <w:t xml:space="preserve">Pads: P1-P7 LSU and CAN, P8 K-line, P9/P10 spare low-side outputs, P11 A22 charging wire, P12 FPCU status, P13 D29, P14-P18 spare MCU pins (IGN6-8, I2C SCL/SDA), P19-P22 rails, P23 BOOT0, P24-P26 SWD, P27/P28 OUT_PWM3 / IN_RES2, P29-P31 aux inputs, P32 M8 power-good (+5VA, +3.3V, +12V_RAW, GND), plus a prototype area G1 for any extra circuit.</w:t>
+        <w:t xml:space="preserve">Pads (no assembly cost): LSU 4.9 and CAN on the Comms sheet; K-line, D29 and A22 charging wire; spare low-side outputs and FPCU status on Outputs; BOOT0 and SWD on MCU and USB; spare MCU pins (IGN6-8, I2C, OUT_PWM3, IN_RES2), aux inputs, M8 power-good and every rail on the Aux sheet, next to the prototype area G1.</w:t>
       </w:r>
     </w:p>
     <w:p>
@@ -2878,7 +4466,16 @@
         <w:t xml:space="preserve">Update PCB from Schematic</w:t>
       </w:r>
       <w:r>
-        <w:t xml:space="preserve">, then place and route the new parts (Q9-Q20, R11-R22 in the low-side sheets, R30-R52, JP1-JP11, F6-F7, P1-P32, M10-M12, J2, J3, G1; M8 now wired).</w:t>
+        <w:t xml:space="preserve"> with </w:t>
+      </w:r>
+      <w:r>
+        <w:rPr>
+          <w:b/>
+        </w:rPr>
+        <w:t xml:space="preserve">Re-link footprints to schematic symbols based on their references</w:t>
+      </w:r>
+      <w:r>
+        <w:t xml:space="preserve"> ticked (the sheet split changed every symbol's sheet path), then place and route the new parts (everything not yet on the board: Q9-Q20 and R11-R22 in the low-side sheets, R30-R54, JP1-JP12, F6-F7, P1-P32, M10-M12, J2, U1, J3, G1; M8 now wired).</w:t>
       </w:r>
     </w:p>
     <w:p>

</xml_diff>